<commit_message>
Refresh combined pack with HMO comparison
Co-Authored-By: Claude Sonnet 5.5 <noreply@anthropic.com>
Claude-Session: https://claude.ai/code/session_01WQM9cMeDvrakvPTqSusGhx
</commit_message>
<xml_diff>
--- a/planning-sandhill-road/preapp-response/Cleethorpes-Avenue-preapp-pack.docx
+++ b/planning-sandhill-road/preapp-response/Cleethorpes-Avenue-preapp-pack.docx
@@ -498,6 +498,190 @@
       </w:pPr>
       <w:r>
         <w:t xml:space="preserve">Enc: drawing schedule; cover note</w:t>
+      </w:r>
+    </w:p>
+    <w:p>
+      <w:pPr>
+        <w:pStyle w:val="BodyText"/>
+      </w:pPr>
+      <w:r>
+        <w:rPr>
+          <w:bCs/>
+          <w:b/>
+        </w:rPr>
+        <w:t xml:space="preserve">Cover note – request for a second pre-application meeting</w:t>
+      </w:r>
+    </w:p>
+    <w:p>
+      <w:pPr>
+        <w:pStyle w:val="BodyText"/>
+      </w:pPr>
+      <w:r>
+        <w:t xml:space="preserve">Site: Land adjacent to 1 Cleethorpes Avenue, Blackley, Manchester M9 8JT (fronting Sandyhill Road)</w:t>
+      </w:r>
+      <w:r>
+        <w:t xml:space="preserve"> </w:t>
+      </w:r>
+      <w:r>
+        <w:t xml:space="preserve">Pre-application ref: [TO BE CONFIRMED] From: Shaeba Nokhbehrousta Date: [DATE]</w:t>
+      </w:r>
+    </w:p>
+    <w:p>
+      <w:pPr>
+        <w:pStyle w:val="BodyText"/>
+      </w:pPr>
+      <w:r>
+        <w:t xml:space="preserve">This is a request for a second pre-application opinion. It is</w:t>
+      </w:r>
+      <w:r>
+        <w:t xml:space="preserve"> </w:t>
+      </w:r>
+      <w:r>
+        <w:rPr>
+          <w:bCs/>
+          <w:b/>
+        </w:rPr>
+        <w:t xml:space="preserve">not</w:t>
+      </w:r>
+      <w:r>
+        <w:t xml:space="preserve"> </w:t>
+      </w:r>
+      <w:r>
+        <w:t xml:space="preserve">a planning application.</w:t>
+      </w:r>
+    </w:p>
+    <w:p>
+      <w:pPr>
+        <w:pStyle w:val="BodyText"/>
+      </w:pPr>
+      <w:r>
+        <w:rPr>
+          <w:bCs/>
+          <w:b/>
+        </w:rPr>
+        <w:t xml:space="preserve">Enclosed</w:t>
+      </w:r>
+      <w:r>
+        <w:t xml:space="preserve"> </w:t>
+      </w:r>
+      <w:r>
+        <w:t xml:space="preserve">1. Response letter answering the eight points in your reply to my enquiry of 18 August 2026.</w:t>
+      </w:r>
+      <w:r>
+        <w:t xml:space="preserve"> </w:t>
+      </w:r>
+      <w:r>
+        <w:t xml:space="preserve">2. Drawing schedule.</w:t>
+      </w:r>
+      <w:r>
+        <w:t xml:space="preserve"> </w:t>
+      </w:r>
+      <w:r>
+        <w:t xml:space="preserve">3. Topographical survey (00) and sheets 01–08 and 12: [DELETE ANY NOT READY].</w:t>
+      </w:r>
+    </w:p>
+    <w:p>
+      <w:pPr>
+        <w:pStyle w:val="BodyText"/>
+      </w:pPr>
+      <w:r>
+        <w:rPr>
+          <w:bCs/>
+          <w:b/>
+        </w:rPr>
+        <w:t xml:space="preserve">Scheme for discussion</w:t>
+      </w:r>
+      <w:r>
+        <w:t xml:space="preserve"> </w:t>
+      </w:r>
+      <w:r>
+        <w:t xml:space="preserve">The first concept is replaced. The scheme for discussion is a two-storey 2-bedroom, 4-person house at the west</w:t>
+      </w:r>
+      <w:r>
+        <w:t xml:space="preserve"> </w:t>
+      </w:r>
+      <w:r>
+        <w:t xml:space="preserve">end of the plot, on the neighbours’ building line, with a lower ridge, a gap beside No.1 and parking in front.</w:t>
+      </w:r>
+      <w:r>
+        <w:t xml:space="preserve"> </w:t>
+      </w:r>
+      <w:r>
+        <w:t xml:space="preserve">Fallback: single-storey, or no development, if the BRE 209 tests or the survey show it cannot work.</w:t>
+      </w:r>
+    </w:p>
+    <w:p>
+      <w:pPr>
+        <w:pStyle w:val="BodyText"/>
+      </w:pPr>
+      <w:r>
+        <w:rPr>
+          <w:bCs/>
+          <w:b/>
+        </w:rPr>
+        <w:t xml:space="preserve">What I would like from the meeting</w:t>
+      </w:r>
+      <w:r>
+        <w:t xml:space="preserve"> </w:t>
+      </w:r>
+      <w:r>
+        <w:t xml:space="preserve">- Your view on whether the reduced scheme overcomes the concerns about levels, building line</w:t>
+      </w:r>
+      <w:r>
+        <w:t xml:space="preserve"> </w:t>
+      </w:r>
+      <w:r>
+        <w:t xml:space="preserve">and the two side windows of No.1.</w:t>
+      </w:r>
+      <w:r>
+        <w:t xml:space="preserve"> </w:t>
+      </w:r>
+      <w:r>
+        <w:t xml:space="preserve">- Which policies and standards you want the planning statement tested against.</w:t>
+      </w:r>
+      <w:r>
+        <w:t xml:space="preserve"> </w:t>
+      </w:r>
+      <w:r>
+        <w:t xml:space="preserve">- Highways comments on access from Sandyhill Road near the Cleethorpes Avenue junction.</w:t>
+      </w:r>
+      <w:r>
+        <w:t xml:space="preserve"> </w:t>
+      </w:r>
+      <w:r>
+        <w:t xml:space="preserve">- Whether the Council’s Property Transactions team needs to be involved at this stage.</w:t>
+      </w:r>
+    </w:p>
+    <w:p>
+      <w:pPr>
+        <w:pStyle w:val="BodyText"/>
+      </w:pPr>
+      <w:r>
+        <w:rPr>
+          <w:bCs/>
+          <w:b/>
+        </w:rPr>
+        <w:t xml:space="preserve">Not yet available</w:t>
+      </w:r>
+      <w:r>
+        <w:t xml:space="preserve"> </w:t>
+      </w:r>
+      <w:r>
+        <w:t xml:space="preserve">(see assumptions table): [LIST ANY OUTSTANDING ITEMS, e.g. daylight report,</w:t>
+      </w:r>
+      <w:r>
+        <w:t xml:space="preserve"> </w:t>
+      </w:r>
+      <w:r>
+        <w:t xml:space="preserve">BNG baseline].</w:t>
+      </w:r>
+    </w:p>
+    <w:p>
+      <w:pPr>
+        <w:pStyle w:val="BodyText"/>
+      </w:pPr>
+      <w:r>
+        <w:t xml:space="preserve">Shaeba Nokhbehrousta · [PHONE] · nshaeba@yahoo.com</w:t>
       </w:r>
     </w:p>
     <w:bookmarkStart w:id="20" w:name="X8521e96697efb0f2c357950c81e560d51c0171e"/>
@@ -1836,7 +2020,7 @@
               <w:jc w:val="left"/>
             </w:pPr>
             <w:r>
-              <w:t xml:space="preserve">Access, visibility splays, parking, bin and cycle detail</w:t>
+              <w:t xml:space="preserve">Access, dropped kerb, two parking bays, visibility splays, bin and cycle detail</w:t>
             </w:r>
           </w:p>
         </w:tc>
@@ -3408,6 +3592,14 @@
         <w:t xml:space="preserve">13 | The owner does not need a garden; only parking at the front. Private outdoor space may therefore be limited to a small yard, balcony or none | Owner | Officer may object to a family house with no outdoor space |</w:t>
       </w:r>
     </w:p>
+    <w:p>
+      <w:pPr>
+        <w:pStyle w:val="BodyText"/>
+      </w:pPr>
+      <w:r>
+        <w:t xml:space="preserve">14 | Two front parking spaces wanted (taken as two bays side by side served by one dropped kerb). Bay size assumed 2.5 × 5.0 m; Council’s size and crossover width not verified | Owner | Forecourt may be too shallow; highways may refuse |</w:t>
+      </w:r>
+    </w:p>
     <w:bookmarkEnd w:id="22"/>
     <w:bookmarkStart w:id="23" w:name="Xa87a9fad9cd97ee4fbd828469c6105011d6fba6"/>
     <w:p>
@@ -3724,199 +3916,15 @@
         <w:t xml:space="preserve">What is your budget for survey, architect and daylight report?</w:t>
       </w:r>
     </w:p>
-    <w:p>
-      <w:pPr>
-        <w:pStyle w:val="FirstParagraph"/>
-      </w:pPr>
-      <w:r>
-        <w:rPr>
-          <w:bCs/>
-          <w:b/>
-        </w:rPr>
-        <w:t xml:space="preserve">Cover note – request for a second pre-application meeting</w:t>
-      </w:r>
-    </w:p>
-    <w:p>
-      <w:pPr>
-        <w:pStyle w:val="BodyText"/>
-      </w:pPr>
-      <w:r>
-        <w:t xml:space="preserve">Site: Land adjacent to 1 Cleethorpes Avenue, Blackley, Manchester M9 8JT (fronting Sandyhill Road)</w:t>
-      </w:r>
-      <w:r>
-        <w:t xml:space="preserve"> </w:t>
-      </w:r>
-      <w:r>
-        <w:t xml:space="preserve">Pre-application ref: [TO BE CONFIRMED] From: Shaeba Nokhbehrousta Date: [DATE]</w:t>
-      </w:r>
-    </w:p>
-    <w:p>
-      <w:pPr>
-        <w:pStyle w:val="BodyText"/>
-      </w:pPr>
-      <w:r>
-        <w:t xml:space="preserve">This is a request for a second pre-application opinion. It is</w:t>
-      </w:r>
-      <w:r>
-        <w:t xml:space="preserve"> </w:t>
-      </w:r>
-      <w:r>
-        <w:rPr>
-          <w:bCs/>
-          <w:b/>
-        </w:rPr>
-        <w:t xml:space="preserve">not</w:t>
-      </w:r>
-      <w:r>
-        <w:t xml:space="preserve"> </w:t>
-      </w:r>
-      <w:r>
-        <w:t xml:space="preserve">a planning application.</w:t>
-      </w:r>
-    </w:p>
-    <w:p>
-      <w:pPr>
-        <w:pStyle w:val="BodyText"/>
-      </w:pPr>
-      <w:r>
-        <w:rPr>
-          <w:bCs/>
-          <w:b/>
-        </w:rPr>
-        <w:t xml:space="preserve">Enclosed</w:t>
-      </w:r>
-      <w:r>
-        <w:t xml:space="preserve"> </w:t>
-      </w:r>
-      <w:r>
-        <w:t xml:space="preserve">1. Response letter answering the eight points in your reply to my enquiry of 18 August 2026.</w:t>
-      </w:r>
-      <w:r>
-        <w:t xml:space="preserve"> </w:t>
-      </w:r>
-      <w:r>
-        <w:t xml:space="preserve">2. Drawing schedule.</w:t>
-      </w:r>
-      <w:r>
-        <w:t xml:space="preserve"> </w:t>
-      </w:r>
-      <w:r>
-        <w:t xml:space="preserve">3. Topographical survey (00) and sheets 01–08 and 12: [DELETE ANY NOT READY].</w:t>
-      </w:r>
-    </w:p>
-    <w:p>
-      <w:pPr>
-        <w:pStyle w:val="BodyText"/>
-      </w:pPr>
-      <w:r>
-        <w:rPr>
-          <w:bCs/>
-          <w:b/>
-        </w:rPr>
-        <w:t xml:space="preserve">Scheme for discussion</w:t>
-      </w:r>
-      <w:r>
-        <w:t xml:space="preserve"> </w:t>
-      </w:r>
-      <w:r>
-        <w:t xml:space="preserve">The first concept is replaced. The scheme for discussion is a two-storey 2-bedroom, 4-person house at the west</w:t>
-      </w:r>
-      <w:r>
-        <w:t xml:space="preserve"> </w:t>
-      </w:r>
-      <w:r>
-        <w:t xml:space="preserve">end of the plot, on the neighbours’ building line, with a lower ridge, a gap beside No.1 and parking in front.</w:t>
-      </w:r>
-      <w:r>
-        <w:t xml:space="preserve"> </w:t>
-      </w:r>
-      <w:r>
-        <w:t xml:space="preserve">Fallback: single-storey, or no development, if the BRE 209 tests or the survey show it cannot work.</w:t>
-      </w:r>
-    </w:p>
-    <w:p>
-      <w:pPr>
-        <w:pStyle w:val="BodyText"/>
-      </w:pPr>
-      <w:r>
-        <w:rPr>
-          <w:bCs/>
-          <w:b/>
-        </w:rPr>
-        <w:t xml:space="preserve">What I would like from the meeting</w:t>
-      </w:r>
-      <w:r>
-        <w:t xml:space="preserve"> </w:t>
-      </w:r>
-      <w:r>
-        <w:t xml:space="preserve">- Your view on whether the reduced scheme overcomes the concerns about levels, building line</w:t>
-      </w:r>
-      <w:r>
-        <w:t xml:space="preserve"> </w:t>
-      </w:r>
-      <w:r>
-        <w:t xml:space="preserve">and the two side windows of No.1.</w:t>
-      </w:r>
-      <w:r>
-        <w:t xml:space="preserve"> </w:t>
-      </w:r>
-      <w:r>
-        <w:t xml:space="preserve">- Which policies and standards you want the planning statement tested against.</w:t>
-      </w:r>
-      <w:r>
-        <w:t xml:space="preserve"> </w:t>
-      </w:r>
-      <w:r>
-        <w:t xml:space="preserve">- Highways comments on access from Sandyhill Road near the Cleethorpes Avenue junction.</w:t>
-      </w:r>
-      <w:r>
-        <w:t xml:space="preserve"> </w:t>
-      </w:r>
-      <w:r>
-        <w:t xml:space="preserve">- Whether the Council’s Property Transactions team needs to be involved at this stage.</w:t>
-      </w:r>
-    </w:p>
-    <w:p>
-      <w:pPr>
-        <w:pStyle w:val="BodyText"/>
-      </w:pPr>
-      <w:r>
-        <w:rPr>
-          <w:bCs/>
-          <w:b/>
-        </w:rPr>
-        <w:t xml:space="preserve">Not yet available</w:t>
-      </w:r>
-      <w:r>
-        <w:t xml:space="preserve"> </w:t>
-      </w:r>
-      <w:r>
-        <w:t xml:space="preserve">(see assumptions table): [LIST ANY OUTSTANDING ITEMS, e.g. daylight report,</w:t>
-      </w:r>
-      <w:r>
-        <w:t xml:space="preserve"> </w:t>
-      </w:r>
-      <w:r>
-        <w:t xml:space="preserve">BNG baseline].</w:t>
-      </w:r>
-    </w:p>
-    <w:p>
-      <w:pPr>
-        <w:pStyle w:val="BodyText"/>
-      </w:pPr>
-      <w:r>
-        <w:t xml:space="preserve">Shaeba Nokhbehrousta · [PHONE] · nshaeba@yahoo.com</w:t>
-      </w:r>
-    </w:p>
     <w:bookmarkEnd w:id="24"/>
     <w:bookmarkEnd w:id="25"/>
-    <w:bookmarkStart w:id="49" w:name="Xb878f947b69892dbd4537e4cf5576d341793e07"/>
+    <w:bookmarkStart w:id="30" w:name="could-this-be-an-hmo-hmo-vs-2-bed-house"/>
     <w:p>
       <w:pPr>
         <w:pStyle w:val="Heading1"/>
       </w:pPr>
       <w:r>
-        <w:t xml:space="preserve">Technical appendix: methods, policy references and options</w:t>
+        <w:t xml:space="preserve">Could this be an HMO? HMO vs 2-bed house</w:t>
       </w:r>
     </w:p>
     <w:p>
@@ -3924,7 +3932,7 @@
         <w:pStyle w:val="FirstParagraph"/>
       </w:pPr>
       <w:r>
-        <w:t xml:space="preserve">No site measurements appear here. Anything site-specific is</w:t>
+        <w:t xml:space="preserve">See</w:t>
       </w:r>
       <w:r>
         <w:t xml:space="preserve"> </w:t>
@@ -3933,19 +3941,88 @@
         <w:rPr>
           <w:rStyle w:val="VerbatimChar"/>
         </w:rPr>
-        <w:t xml:space="preserve">[TO BE SURVEYED]</w:t>
-      </w:r>
-      <w:r>
-        <w:t xml:space="preserve">.</w:t>
-      </w:r>
-    </w:p>
-    <w:bookmarkStart w:id="26" w:name="point-3-levels-cut-and-fill"/>
+        <w:t xml:space="preserve">layouts-2bed-vs-hmo.svg</w:t>
+      </w:r>
+      <w:r>
+        <w:t xml:space="preserve"> </w:t>
+      </w:r>
+      <w:r>
+        <w:t xml:space="preserve">/</w:t>
+      </w:r>
+      <w:r>
+        <w:t xml:space="preserve"> </w:t>
+      </w:r>
+      <w:r>
+        <w:rPr>
+          <w:rStyle w:val="VerbatimChar"/>
+        </w:rPr>
+        <w:t xml:space="preserve">.png</w:t>
+      </w:r>
+      <w:r>
+        <w:t xml:space="preserve"> </w:t>
+      </w:r>
+      <w:r>
+        <w:t xml:space="preserve">for notional layouts (concept only, not fitted to the site).</w:t>
+      </w:r>
+    </w:p>
+    <w:bookmarkStart w:id="26" w:name="short-answer"/>
     <w:p>
       <w:pPr>
         <w:pStyle w:val="Heading2"/>
       </w:pPr>
       <w:r>
-        <w:t xml:space="preserve">Point 3 – Levels, cut and fill</w:t>
+        <w:t xml:space="preserve">Short answer</w:t>
+      </w:r>
+    </w:p>
+    <w:p>
+      <w:pPr>
+        <w:pStyle w:val="FirstParagraph"/>
+      </w:pPr>
+      <w:r>
+        <w:t xml:space="preserve">An HMO could be proposed, but I would not expect it to help. Everything the officer is worried about</w:t>
+      </w:r>
+      <w:r>
+        <w:t xml:space="preserve"> </w:t>
+      </w:r>
+      <w:r>
+        <w:t xml:space="preserve">(light to No.1, building line, slope, parking) gets harder when more unrelated adults live in the same</w:t>
+      </w:r>
+      <w:r>
+        <w:t xml:space="preserve"> </w:t>
+      </w:r>
+      <w:r>
+        <w:t xml:space="preserve">footprint, and the Council already says it is</w:t>
+      </w:r>
+      <w:r>
+        <w:t xml:space="preserve"> </w:t>
+      </w:r>
+      <w:r>
+        <w:t xml:space="preserve">“</w:t>
+      </w:r>
+      <w:r>
+        <w:t xml:space="preserve">yet to be convinced</w:t>
+      </w:r>
+      <w:r>
+        <w:t xml:space="preserve">”</w:t>
+      </w:r>
+      <w:r>
+        <w:t xml:space="preserve">. It is also a different application</w:t>
+      </w:r>
+      <w:r>
+        <w:t xml:space="preserve"> </w:t>
+      </w:r>
+      <w:r>
+        <w:t xml:space="preserve">to describe honestly: it must say what use is intended.</w:t>
+      </w:r>
+    </w:p>
+    <w:bookmarkEnd w:id="26"/>
+    <w:bookmarkStart w:id="27" w:name="Xe40e262951fb83afd9bb1de1de13b59825f0a3a"/>
+    <w:p>
+      <w:pPr>
+        <w:pStyle w:val="Heading2"/>
+      </w:pPr>
+      <w:r>
+        <w:t xml:space="preserve">Facts to check (not verified; confirm with Manchester City Council)</w:t>
       </w:r>
     </w:p>
     <w:p>
@@ -3957,13 +4034,40 @@
         <w:pStyle w:val="Compact"/>
       </w:pPr>
       <w:r>
-        <w:t xml:space="preserve">Surveyor to supply a ground model (spot heights on a grid of 2–5 m plus the road kerb, No.1’s</w:t>
-      </w:r>
-      <w:r>
-        <w:t xml:space="preserve"> </w:t>
-      </w:r>
-      <w:r>
-        <w:t xml:space="preserve">threshold and DPC levels).</w:t>
+        <w:t xml:space="preserve">A small HMO (3–6 unrelated people sharing) is use class C4; more than six is sui generis. A new-build</w:t>
+      </w:r>
+      <w:r>
+        <w:t xml:space="preserve"> </w:t>
+      </w:r>
+      <w:r>
+        <w:t xml:space="preserve">house is C3 unless it is applied for as an HMO. Changing C3 to C4 is normally permitted development,</w:t>
+      </w:r>
+      <w:r>
+        <w:t xml:space="preserve"> </w:t>
+      </w:r>
+      <w:r>
+        <w:rPr>
+          <w:bCs/>
+          <w:b/>
+        </w:rPr>
+        <w:t xml:space="preserve">unless</w:t>
+      </w:r>
+      <w:r>
+        <w:rPr>
+          <w:bCs/>
+          <w:b/>
+        </w:rPr>
+        <w:t xml:space="preserve"> </w:t>
+      </w:r>
+      <w:r>
+        <w:rPr>
+          <w:bCs/>
+          <w:b/>
+        </w:rPr>
+        <w:t xml:space="preserve">an Article 4 direction removes it</w:t>
+      </w:r>
+      <w:r>
+        <w:t xml:space="preserve">. I do not know whether M9 8JT is covered. Ask the Council.</w:t>
       </w:r>
     </w:p>
     <w:p>
@@ -3975,19 +4079,7 @@
         <w:pStyle w:val="Compact"/>
       </w:pPr>
       <w:r>
-        <w:t xml:space="preserve">Cut/fill: for each grid cell, (existing level − formation level) × cell area. Sum cut and fill</w:t>
-      </w:r>
-      <w:r>
-        <w:t xml:space="preserve"> </w:t>
-      </w:r>
-      <w:r>
-        <w:t xml:space="preserve">separately. Report net import or export. Add foundation and topsoil strip. Bulking factor:</w:t>
-      </w:r>
-      <w:r>
-        <w:t xml:space="preserve"> </w:t>
-      </w:r>
-      <w:r>
-        <w:t xml:space="preserve">[TO BE SURVEYED / ENGINEER].</w:t>
+        <w:t xml:space="preserve">Do not build as a house with a plan to convert quietly: declare the intended use.</w:t>
       </w:r>
     </w:p>
     <w:p>
@@ -3999,13 +4091,13 @@
         <w:pStyle w:val="Compact"/>
       </w:pPr>
       <w:r>
-        <w:t xml:space="preserve">Honest test: if the difference between the highest and lowest corner is [TO BE SURVEYED] and the</w:t>
-      </w:r>
-      <w:r>
-        <w:t xml:space="preserve"> </w:t>
-      </w:r>
-      <w:r>
-        <w:t xml:space="preserve">retaining wall needed is more than [ENGINEER’S THRESHOLD], say so in the letter.</w:t>
+        <w:t xml:space="preserve">Licensing: an HMO for five or more people from two or more households needs a mandatory licence. The Council</w:t>
+      </w:r>
+      <w:r>
+        <w:t xml:space="preserve"> </w:t>
+      </w:r>
+      <w:r>
+        <w:t xml:space="preserve">may have additional licensing for smaller HMOs. Check.</w:t>
       </w:r>
     </w:p>
     <w:p>
@@ -4017,65 +4109,441 @@
         <w:pStyle w:val="Compact"/>
       </w:pPr>
       <w:r>
-        <w:t xml:space="preserve">Design response if the slope is substantial: split-level or stepped plan following the contour,</w:t>
-      </w:r>
-      <w:r>
-        <w:t xml:space="preserve"> </w:t>
-      </w:r>
-      <w:r>
-        <w:t xml:space="preserve">FFL set at the mid-point to balance cut and fill, retaining walls kept away from No.1’s boundary.</w:t>
-      </w:r>
-    </w:p>
-    <w:bookmarkEnd w:id="26"/>
-    <w:bookmarkStart w:id="27" w:name="point-4-building-line"/>
+        <w:t xml:space="preserve">Standards: the national minimum licensing bedroom sizes are 6.51 m² for one adult and 10.22 m² for two.</w:t>
+      </w:r>
+      <w:r>
+        <w:t xml:space="preserve"> </w:t>
+      </w:r>
+      <w:r>
+        <w:t xml:space="preserve">The Council has its own amenity standards for kitchens, bathrooms and shared rooms (not checked).</w:t>
+      </w:r>
+    </w:p>
+    <w:p>
+      <w:pPr>
+        <w:numPr>
+          <w:ilvl w:val="0"/>
+          <w:numId w:val="1002"/>
+        </w:numPr>
+        <w:pStyle w:val="Compact"/>
+      </w:pPr>
+      <w:r>
+        <w:t xml:space="preserve">Parking, bins, noise and cycle storage are scrutinised more for an HMO.</w:t>
+      </w:r>
+    </w:p>
+    <w:bookmarkEnd w:id="27"/>
+    <w:bookmarkStart w:id="28" w:name="comparison"/>
     <w:p>
       <w:pPr>
         <w:pStyle w:val="Heading2"/>
       </w:pPr>
       <w:r>
-        <w:t xml:space="preserve">Point 4 – Building line</w:t>
-      </w:r>
-    </w:p>
-    <w:p>
-      <w:pPr>
-        <w:pStyle w:val="FirstParagraph"/>
-      </w:pPr>
-      <w:r>
-        <w:t xml:space="preserve">Measure the front wall of each neighbour from a fixed datum (the back of footway). Draw the line</w:t>
-      </w:r>
-      <w:r>
-        <w:t xml:space="preserve"> </w:t>
-      </w:r>
-      <w:r>
-        <w:t xml:space="preserve">across the plot. Then: aligned depth = plot depth − (offset between the proposed and aligned</w:t>
-      </w:r>
-      <w:r>
-        <w:t xml:space="preserve"> </w:t>
-      </w:r>
-      <w:r>
-        <w:t xml:space="preserve">fronts). Minimum footprint per floor from NDSS GIA ÷ number of storeys, plus wall thickness</w:t>
-      </w:r>
-      <w:r>
-        <w:t xml:space="preserve"> </w:t>
-      </w:r>
-      <w:r>
-        <w:t xml:space="preserve">(GIA is measured internally). Examples: 2-storey 3b5p (93 m²) needs at least 46.5 m² per floor</w:t>
-      </w:r>
-      <w:r>
-        <w:t xml:space="preserve"> </w:t>
-      </w:r>
-      <w:r>
-        <w:t xml:space="preserve">plus walls; single-storey 2b3p (61 m²) needs at least 61 m² plus walls.</w:t>
-      </w:r>
-    </w:p>
-    <w:bookmarkEnd w:id="27"/>
-    <w:bookmarkStart w:id="28" w:name="point-5-bre-209-3rd-edition-2022-tests"/>
+        <w:t xml:space="preserve">Comparison</w:t>
+      </w:r>
+    </w:p>
+    <w:tbl>
+      <w:tblPr>
+        <w:tblStyle w:val="Table"/>
+        <w:tblW w:type="pct" w:w="5000"/>
+        <w:tblLook w:firstRow="1" w:lastRow="0" w:firstColumn="0" w:lastColumn="0" w:noHBand="0" w:noVBand="0" w:val="0020"/>
+        <w:jc w:val="start"/>
+      </w:tblPr>
+      <w:tblGrid>
+        <w:gridCol w:w="2640"/>
+        <w:gridCol w:w="2640"/>
+        <w:gridCol w:w="2640"/>
+      </w:tblGrid>
+      <w:tr>
+        <w:trPr>
+          <w:tblHeader w:val="true"/>
+        </w:trPr>
+        <w:tc>
+          <w:tcPr/>
+          <w:p>
+            <w:pPr>
+              <w:pStyle w:val="Compact"/>
+            </w:pPr>
+          </w:p>
+        </w:tc>
+        <w:tc>
+          <w:tcPr/>
+          <w:p>
+            <w:pPr>
+              <w:pStyle w:val="Compact"/>
+              <w:jc w:val="left"/>
+            </w:pPr>
+            <w:r>
+              <w:t xml:space="preserve">2-bed house (2b4p)</w:t>
+            </w:r>
+          </w:p>
+        </w:tc>
+        <w:tc>
+          <w:tcPr/>
+          <w:p>
+            <w:pPr>
+              <w:pStyle w:val="Compact"/>
+              <w:jc w:val="left"/>
+            </w:pPr>
+            <w:r>
+              <w:t xml:space="preserve">HMO (4 people)</w:t>
+            </w:r>
+          </w:p>
+        </w:tc>
+      </w:tr>
+      <w:tr>
+        <w:tc>
+          <w:tcPr/>
+          <w:p>
+            <w:pPr>
+              <w:pStyle w:val="Compact"/>
+              <w:jc w:val="left"/>
+            </w:pPr>
+            <w:r>
+              <w:t xml:space="preserve">Use class</w:t>
+            </w:r>
+          </w:p>
+        </w:tc>
+        <w:tc>
+          <w:tcPr/>
+          <w:p>
+            <w:pPr>
+              <w:pStyle w:val="Compact"/>
+              <w:jc w:val="left"/>
+            </w:pPr>
+            <w:r>
+              <w:t xml:space="preserve">C3</w:t>
+            </w:r>
+          </w:p>
+        </w:tc>
+        <w:tc>
+          <w:tcPr/>
+          <w:p>
+            <w:pPr>
+              <w:pStyle w:val="Compact"/>
+              <w:jc w:val="left"/>
+            </w:pPr>
+            <w:r>
+              <w:t xml:space="preserve">C4 (declare it)</w:t>
+            </w:r>
+          </w:p>
+        </w:tc>
+      </w:tr>
+      <w:tr>
+        <w:tc>
+          <w:tcPr/>
+          <w:p>
+            <w:pPr>
+              <w:pStyle w:val="Compact"/>
+              <w:jc w:val="left"/>
+            </w:pPr>
+            <w:r>
+              <w:t xml:space="preserve">Floor area in the notional layouts</w:t>
+            </w:r>
+          </w:p>
+        </w:tc>
+        <w:tc>
+          <w:tcPr/>
+          <w:p>
+            <w:pPr>
+              <w:pStyle w:val="Compact"/>
+              <w:jc w:val="left"/>
+            </w:pPr>
+            <w:r>
+              <w:t xml:space="preserve">about 80 m² (NDSS minimum 79 m²)</w:t>
+            </w:r>
+          </w:p>
+        </w:tc>
+        <w:tc>
+          <w:tcPr/>
+          <w:p>
+            <w:pPr>
+              <w:pStyle w:val="Compact"/>
+              <w:jc w:val="left"/>
+            </w:pPr>
+            <w:r>
+              <w:t xml:space="preserve">about 80 m²</w:t>
+            </w:r>
+          </w:p>
+        </w:tc>
+      </w:tr>
+      <w:tr>
+        <w:tc>
+          <w:tcPr/>
+          <w:p>
+            <w:pPr>
+              <w:pStyle w:val="Compact"/>
+              <w:jc w:val="left"/>
+            </w:pPr>
+            <w:r>
+              <w:t xml:space="preserve">Bedrooms</w:t>
+            </w:r>
+          </w:p>
+        </w:tc>
+        <w:tc>
+          <w:tcPr/>
+          <w:p>
+            <w:pPr>
+              <w:pStyle w:val="Compact"/>
+              <w:jc w:val="left"/>
+            </w:pPr>
+            <w:r>
+              <w:t xml:space="preserve">2 doubles, each at least 11.5 m²</w:t>
+            </w:r>
+          </w:p>
+        </w:tc>
+        <w:tc>
+          <w:tcPr/>
+          <w:p>
+            <w:pPr>
+              <w:pStyle w:val="Compact"/>
+              <w:jc w:val="left"/>
+            </w:pPr>
+            <w:r>
+              <w:t xml:space="preserve">4 single, about 7.4–11.5 m² (meets 6.51 m² licensing minimum; most are below 7.5 m²)</w:t>
+            </w:r>
+          </w:p>
+        </w:tc>
+      </w:tr>
+      <w:tr>
+        <w:tc>
+          <w:tcPr/>
+          <w:p>
+            <w:pPr>
+              <w:pStyle w:val="Compact"/>
+              <w:jc w:val="left"/>
+            </w:pPr>
+            <w:r>
+              <w:t xml:space="preserve">Impact on No.1</w:t>
+            </w:r>
+          </w:p>
+        </w:tc>
+        <w:tc>
+          <w:tcPr/>
+          <w:p>
+            <w:pPr>
+              <w:pStyle w:val="Compact"/>
+              <w:jc w:val="left"/>
+            </w:pPr>
+            <w:r>
+              <w:t xml:space="preserve">same footprint and height</w:t>
+            </w:r>
+          </w:p>
+        </w:tc>
+        <w:tc>
+          <w:tcPr/>
+          <w:p>
+            <w:pPr>
+              <w:pStyle w:val="Compact"/>
+              <w:jc w:val="left"/>
+            </w:pPr>
+            <w:r>
+              <w:t xml:space="preserve">same footprint; more people means more use of windows, noise, bins</w:t>
+            </w:r>
+          </w:p>
+        </w:tc>
+      </w:tr>
+      <w:tr>
+        <w:tc>
+          <w:tcPr/>
+          <w:p>
+            <w:pPr>
+              <w:pStyle w:val="Compact"/>
+              <w:jc w:val="left"/>
+            </w:pPr>
+            <w:r>
+              <w:t xml:space="preserve">Parking and bins</w:t>
+            </w:r>
+          </w:p>
+        </w:tc>
+        <w:tc>
+          <w:tcPr/>
+          <w:p>
+            <w:pPr>
+              <w:pStyle w:val="Compact"/>
+              <w:jc w:val="left"/>
+            </w:pPr>
+            <w:r>
+              <w:t xml:space="preserve">one space and normal bins</w:t>
+            </w:r>
+          </w:p>
+        </w:tc>
+        <w:tc>
+          <w:tcPr/>
+          <w:p>
+            <w:pPr>
+              <w:pStyle w:val="Compact"/>
+              <w:jc w:val="left"/>
+            </w:pPr>
+            <w:r>
+              <w:t xml:space="preserve">officer and highways likely to want more</w:t>
+            </w:r>
+          </w:p>
+        </w:tc>
+      </w:tr>
+      <w:tr>
+        <w:tc>
+          <w:tcPr/>
+          <w:p>
+            <w:pPr>
+              <w:pStyle w:val="Compact"/>
+              <w:jc w:val="left"/>
+            </w:pPr>
+            <w:r>
+              <w:t xml:space="preserve">Outdoor space</w:t>
+            </w:r>
+          </w:p>
+        </w:tc>
+        <w:tc>
+          <w:tcPr/>
+          <w:p>
+            <w:pPr>
+              <w:pStyle w:val="Compact"/>
+              <w:jc w:val="left"/>
+            </w:pPr>
+            <w:r>
+              <w:t xml:space="preserve">small yard or none (your wish)</w:t>
+            </w:r>
+          </w:p>
+        </w:tc>
+        <w:tc>
+          <w:tcPr/>
+          <w:p>
+            <w:pPr>
+              <w:pStyle w:val="Compact"/>
+              <w:jc w:val="left"/>
+            </w:pPr>
+            <w:r>
+              <w:t xml:space="preserve">same, but more occupiers</w:t>
+            </w:r>
+          </w:p>
+        </w:tc>
+      </w:tr>
+      <w:tr>
+        <w:tc>
+          <w:tcPr/>
+          <w:p>
+            <w:pPr>
+              <w:pStyle w:val="Compact"/>
+              <w:jc w:val="left"/>
+            </w:pPr>
+            <w:r>
+              <w:t xml:space="preserve">Planning risk</w:t>
+            </w:r>
+          </w:p>
+        </w:tc>
+        <w:tc>
+          <w:tcPr/>
+          <w:p>
+            <w:pPr>
+              <w:pStyle w:val="Compact"/>
+              <w:jc w:val="left"/>
+            </w:pPr>
+            <w:r>
+              <w:t xml:space="preserve">high (slope, building line, daylight)</w:t>
+            </w:r>
+          </w:p>
+        </w:tc>
+        <w:tc>
+          <w:tcPr/>
+          <w:p>
+            <w:pPr>
+              <w:pStyle w:val="Compact"/>
+              <w:jc w:val="left"/>
+            </w:pPr>
+            <w:r>
+              <w:t xml:space="preserve">higher (same plus Article 4, amenity, licensing)</w:t>
+            </w:r>
+          </w:p>
+        </w:tc>
+      </w:tr>
+      <w:tr>
+        <w:tc>
+          <w:tcPr/>
+          <w:p>
+            <w:pPr>
+              <w:pStyle w:val="Compact"/>
+              <w:jc w:val="left"/>
+            </w:pPr>
+            <w:r>
+              <w:t xml:space="preserve">Income</w:t>
+            </w:r>
+          </w:p>
+        </w:tc>
+        <w:tc>
+          <w:tcPr/>
+          <w:p>
+            <w:pPr>
+              <w:pStyle w:val="Compact"/>
+              <w:jc w:val="left"/>
+            </w:pPr>
+            <w:r>
+              <w:t xml:space="preserve">one letting or a sale</w:t>
+            </w:r>
+          </w:p>
+        </w:tc>
+        <w:tc>
+          <w:tcPr/>
+          <w:p>
+            <w:pPr>
+              <w:pStyle w:val="Compact"/>
+              <w:jc w:val="left"/>
+            </w:pPr>
+            <w:r>
+              <w:t xml:space="preserve">rooms let separately, usually more rent</w:t>
+            </w:r>
+          </w:p>
+        </w:tc>
+      </w:tr>
+      <w:tr>
+        <w:tc>
+          <w:tcPr/>
+          <w:p>
+            <w:pPr>
+              <w:pStyle w:val="Compact"/>
+              <w:jc w:val="left"/>
+            </w:pPr>
+            <w:r>
+              <w:t xml:space="preserve">Recommendation</w:t>
+            </w:r>
+          </w:p>
+        </w:tc>
+        <w:tc>
+          <w:tcPr/>
+          <w:p>
+            <w:pPr>
+              <w:pStyle w:val="Compact"/>
+              <w:jc w:val="left"/>
+            </w:pPr>
+            <w:r>
+              <w:rPr>
+                <w:bCs/>
+                <w:b/>
+              </w:rPr>
+              <w:t xml:space="preserve">lead scheme</w:t>
+            </w:r>
+          </w:p>
+        </w:tc>
+        <w:tc>
+          <w:tcPr/>
+          <w:p>
+            <w:pPr>
+              <w:pStyle w:val="Compact"/>
+              <w:jc w:val="left"/>
+            </w:pPr>
+            <w:r>
+              <w:t xml:space="preserve">only if the Council confirms no Article 4 and accepts it in principle</w:t>
+            </w:r>
+          </w:p>
+        </w:tc>
+      </w:tr>
+    </w:tbl>
+    <w:bookmarkEnd w:id="28"/>
+    <w:bookmarkStart w:id="29" w:name="what-to-ask-the-officer"/>
     <w:p>
       <w:pPr>
         <w:pStyle w:val="Heading2"/>
       </w:pPr>
       <w:r>
-        <w:t xml:space="preserve">Point 5 – BRE 209 (3rd edition, 2022) tests</w:t>
+        <w:t xml:space="preserve">What to ask the officer</w:t>
       </w:r>
     </w:p>
     <w:p>
@@ -4087,6 +4555,212 @@
         <w:pStyle w:val="Compact"/>
       </w:pPr>
       <w:r>
+        <w:t xml:space="preserve">Is the site within an Article 4 direction for HMOs?</w:t>
+      </w:r>
+    </w:p>
+    <w:p>
+      <w:pPr>
+        <w:numPr>
+          <w:ilvl w:val="0"/>
+          <w:numId w:val="1003"/>
+        </w:numPr>
+        <w:pStyle w:val="Compact"/>
+      </w:pPr>
+      <w:r>
+        <w:t xml:space="preserve">Would the Council consider a small HMO here at all, or only a family house?</w:t>
+      </w:r>
+    </w:p>
+    <w:p>
+      <w:pPr>
+        <w:numPr>
+          <w:ilvl w:val="0"/>
+          <w:numId w:val="1003"/>
+        </w:numPr>
+        <w:pStyle w:val="Compact"/>
+      </w:pPr>
+      <w:r>
+        <w:t xml:space="preserve">What parking and amenity standards would apply?</w:t>
+      </w:r>
+    </w:p>
+    <w:bookmarkEnd w:id="29"/>
+    <w:bookmarkEnd w:id="30"/>
+    <w:bookmarkStart w:id="56" w:name="Xb878f947b69892dbd4537e4cf5576d341793e07"/>
+    <w:p>
+      <w:pPr>
+        <w:pStyle w:val="Heading1"/>
+      </w:pPr>
+      <w:r>
+        <w:t xml:space="preserve">Technical appendix: methods, policy references and options</w:t>
+      </w:r>
+    </w:p>
+    <w:p>
+      <w:pPr>
+        <w:pStyle w:val="FirstParagraph"/>
+      </w:pPr>
+      <w:r>
+        <w:t xml:space="preserve">No site measurements appear here. Anything site-specific is</w:t>
+      </w:r>
+      <w:r>
+        <w:t xml:space="preserve"> </w:t>
+      </w:r>
+      <w:r>
+        <w:rPr>
+          <w:rStyle w:val="VerbatimChar"/>
+        </w:rPr>
+        <w:t xml:space="preserve">[TO BE SURVEYED]</w:t>
+      </w:r>
+      <w:r>
+        <w:t xml:space="preserve">.</w:t>
+      </w:r>
+    </w:p>
+    <w:bookmarkStart w:id="31" w:name="point-3-levels-cut-and-fill"/>
+    <w:p>
+      <w:pPr>
+        <w:pStyle w:val="Heading2"/>
+      </w:pPr>
+      <w:r>
+        <w:t xml:space="preserve">Point 3 – Levels, cut and fill</w:t>
+      </w:r>
+    </w:p>
+    <w:p>
+      <w:pPr>
+        <w:numPr>
+          <w:ilvl w:val="0"/>
+          <w:numId w:val="1004"/>
+        </w:numPr>
+        <w:pStyle w:val="Compact"/>
+      </w:pPr>
+      <w:r>
+        <w:t xml:space="preserve">Surveyor to supply a ground model (spot heights on a grid of 2–5 m plus the road kerb, No.1’s</w:t>
+      </w:r>
+      <w:r>
+        <w:t xml:space="preserve"> </w:t>
+      </w:r>
+      <w:r>
+        <w:t xml:space="preserve">threshold and DPC levels).</w:t>
+      </w:r>
+    </w:p>
+    <w:p>
+      <w:pPr>
+        <w:numPr>
+          <w:ilvl w:val="0"/>
+          <w:numId w:val="1004"/>
+        </w:numPr>
+        <w:pStyle w:val="Compact"/>
+      </w:pPr>
+      <w:r>
+        <w:t xml:space="preserve">Cut/fill: for each grid cell, (existing level − formation level) × cell area. Sum cut and fill</w:t>
+      </w:r>
+      <w:r>
+        <w:t xml:space="preserve"> </w:t>
+      </w:r>
+      <w:r>
+        <w:t xml:space="preserve">separately. Report net import or export. Add foundation and topsoil strip. Bulking factor:</w:t>
+      </w:r>
+      <w:r>
+        <w:t xml:space="preserve"> </w:t>
+      </w:r>
+      <w:r>
+        <w:t xml:space="preserve">[TO BE SURVEYED / ENGINEER].</w:t>
+      </w:r>
+    </w:p>
+    <w:p>
+      <w:pPr>
+        <w:numPr>
+          <w:ilvl w:val="0"/>
+          <w:numId w:val="1004"/>
+        </w:numPr>
+        <w:pStyle w:val="Compact"/>
+      </w:pPr>
+      <w:r>
+        <w:t xml:space="preserve">Honest test: if the difference between the highest and lowest corner is [TO BE SURVEYED] and the</w:t>
+      </w:r>
+      <w:r>
+        <w:t xml:space="preserve"> </w:t>
+      </w:r>
+      <w:r>
+        <w:t xml:space="preserve">retaining wall needed is more than [ENGINEER’S THRESHOLD], say so in the letter.</w:t>
+      </w:r>
+    </w:p>
+    <w:p>
+      <w:pPr>
+        <w:numPr>
+          <w:ilvl w:val="0"/>
+          <w:numId w:val="1004"/>
+        </w:numPr>
+        <w:pStyle w:val="Compact"/>
+      </w:pPr>
+      <w:r>
+        <w:t xml:space="preserve">Design response if the slope is substantial: split-level or stepped plan following the contour,</w:t>
+      </w:r>
+      <w:r>
+        <w:t xml:space="preserve"> </w:t>
+      </w:r>
+      <w:r>
+        <w:t xml:space="preserve">FFL set at the mid-point to balance cut and fill, retaining walls kept away from No.1’s boundary.</w:t>
+      </w:r>
+    </w:p>
+    <w:bookmarkEnd w:id="31"/>
+    <w:bookmarkStart w:id="32" w:name="point-4-building-line"/>
+    <w:p>
+      <w:pPr>
+        <w:pStyle w:val="Heading2"/>
+      </w:pPr>
+      <w:r>
+        <w:t xml:space="preserve">Point 4 – Building line</w:t>
+      </w:r>
+    </w:p>
+    <w:p>
+      <w:pPr>
+        <w:pStyle w:val="FirstParagraph"/>
+      </w:pPr>
+      <w:r>
+        <w:t xml:space="preserve">Measure the front wall of each neighbour from a fixed datum (the back of footway). Draw the line</w:t>
+      </w:r>
+      <w:r>
+        <w:t xml:space="preserve"> </w:t>
+      </w:r>
+      <w:r>
+        <w:t xml:space="preserve">across the plot. Then: aligned depth = plot depth − (offset between the proposed and aligned</w:t>
+      </w:r>
+      <w:r>
+        <w:t xml:space="preserve"> </w:t>
+      </w:r>
+      <w:r>
+        <w:t xml:space="preserve">fronts). Minimum footprint per floor from NDSS GIA ÷ number of storeys, plus wall thickness</w:t>
+      </w:r>
+      <w:r>
+        <w:t xml:space="preserve"> </w:t>
+      </w:r>
+      <w:r>
+        <w:t xml:space="preserve">(GIA is measured internally). Examples: 2-storey 3b5p (93 m²) needs at least 46.5 m² per floor</w:t>
+      </w:r>
+      <w:r>
+        <w:t xml:space="preserve"> </w:t>
+      </w:r>
+      <w:r>
+        <w:t xml:space="preserve">plus walls; single-storey 2b3p (61 m²) needs at least 61 m² plus walls.</w:t>
+      </w:r>
+    </w:p>
+    <w:bookmarkEnd w:id="32"/>
+    <w:bookmarkStart w:id="33" w:name="point-5-bre-209-3rd-edition-2022-tests"/>
+    <w:p>
+      <w:pPr>
+        <w:pStyle w:val="Heading2"/>
+      </w:pPr>
+      <w:r>
+        <w:t xml:space="preserve">Point 5 – BRE 209 (3rd edition, 2022) tests</w:t>
+      </w:r>
+    </w:p>
+    <w:p>
+      <w:pPr>
+        <w:numPr>
+          <w:ilvl w:val="0"/>
+          <w:numId w:val="1005"/>
+        </w:numPr>
+        <w:pStyle w:val="Compact"/>
+      </w:pPr>
+      <w:r>
         <w:rPr>
           <w:bCs/>
           <w:b/>
@@ -4116,7 +4790,7 @@
       <w:pPr>
         <w:numPr>
           <w:ilvl w:val="0"/>
-          <w:numId w:val="1003"/>
+          <w:numId w:val="1005"/>
         </w:numPr>
         <w:pStyle w:val="Compact"/>
       </w:pPr>
@@ -4138,7 +4812,7 @@
       <w:pPr>
         <w:numPr>
           <w:ilvl w:val="0"/>
-          <w:numId w:val="1003"/>
+          <w:numId w:val="1005"/>
         </w:numPr>
         <w:pStyle w:val="Compact"/>
       </w:pPr>
@@ -4160,7 +4834,7 @@
       <w:pPr>
         <w:numPr>
           <w:ilvl w:val="0"/>
-          <w:numId w:val="1003"/>
+          <w:numId w:val="1005"/>
         </w:numPr>
         <w:pStyle w:val="Compact"/>
       </w:pPr>
@@ -4194,7 +4868,7 @@
       <w:pPr>
         <w:numPr>
           <w:ilvl w:val="0"/>
-          <w:numId w:val="1003"/>
+          <w:numId w:val="1005"/>
         </w:numPr>
         <w:pStyle w:val="Compact"/>
       </w:pPr>
@@ -4216,7 +4890,7 @@
       <w:pPr>
         <w:numPr>
           <w:ilvl w:val="0"/>
-          <w:numId w:val="1004"/>
+          <w:numId w:val="1006"/>
         </w:numPr>
         <w:pStyle w:val="Compact"/>
       </w:pPr>
@@ -4240,7 +4914,7 @@
       <w:pPr>
         <w:numPr>
           <w:ilvl w:val="0"/>
-          <w:numId w:val="1004"/>
+          <w:numId w:val="1006"/>
         </w:numPr>
         <w:pStyle w:val="Compact"/>
       </w:pPr>
@@ -4258,7 +4932,7 @@
       <w:pPr>
         <w:numPr>
           <w:ilvl w:val="0"/>
-          <w:numId w:val="1004"/>
+          <w:numId w:val="1006"/>
         </w:numPr>
         <w:pStyle w:val="Compact"/>
       </w:pPr>
@@ -4284,8 +4958,8 @@
         <w:t xml:space="preserve">unless the figures show it.</w:t>
       </w:r>
     </w:p>
-    <w:bookmarkEnd w:id="28"/>
-    <w:bookmarkStart w:id="29" w:name="point-6-character-analysis-template"/>
+    <w:bookmarkEnd w:id="33"/>
+    <w:bookmarkStart w:id="34" w:name="point-6-character-analysis-template"/>
     <w:p>
       <w:pPr>
         <w:pStyle w:val="Heading2"/>
@@ -4466,8 +5140,8 @@
         </w:tc>
       </w:tr>
     </w:tbl>
-    <w:bookmarkEnd w:id="29"/>
-    <w:bookmarkStart w:id="30" w:name="Xf7eacb087fcd0690dc37016cb1a167e028e2f66"/>
+    <w:bookmarkEnd w:id="34"/>
+    <w:bookmarkStart w:id="35" w:name="Xf7eacb087fcd0690dc37016cb1a167e028e2f66"/>
     <w:p>
       <w:pPr>
         <w:pStyle w:val="Heading2"/>
@@ -5269,8 +5943,8 @@
         <w:t xml:space="preserve">three singles it is a 4b5p (97 m²); it cannot be 4b6p.</w:t>
       </w:r>
     </w:p>
-    <w:bookmarkEnd w:id="30"/>
-    <w:bookmarkStart w:id="31" w:name="X22a0ca15c4fa6c7f5ded67eaf1254e4400268ac"/>
+    <w:bookmarkEnd w:id="35"/>
+    <w:bookmarkStart w:id="36" w:name="X22a0ca15c4fa6c7f5ded67eaf1254e4400268ac"/>
     <w:p>
       <w:pPr>
         <w:pStyle w:val="Heading2"/>
@@ -5283,7 +5957,7 @@
       <w:pPr>
         <w:numPr>
           <w:ilvl w:val="0"/>
-          <w:numId w:val="1005"/>
+          <w:numId w:val="1007"/>
         </w:numPr>
         <w:pStyle w:val="Compact"/>
       </w:pPr>
@@ -5317,7 +5991,7 @@
       <w:pPr>
         <w:numPr>
           <w:ilvl w:val="0"/>
-          <w:numId w:val="1005"/>
+          <w:numId w:val="1007"/>
         </w:numPr>
         <w:pStyle w:val="Compact"/>
       </w:pPr>
@@ -5373,7 +6047,7 @@
       <w:pPr>
         <w:numPr>
           <w:ilvl w:val="0"/>
-          <w:numId w:val="1005"/>
+          <w:numId w:val="1007"/>
         </w:numPr>
         <w:pStyle w:val="Compact"/>
       </w:pPr>
@@ -5440,7 +6114,7 @@
       <w:pPr>
         <w:numPr>
           <w:ilvl w:val="0"/>
-          <w:numId w:val="1005"/>
+          <w:numId w:val="1007"/>
         </w:numPr>
         <w:pStyle w:val="Compact"/>
       </w:pPr>
@@ -5474,7 +6148,7 @@
       <w:pPr>
         <w:numPr>
           <w:ilvl w:val="0"/>
-          <w:numId w:val="1005"/>
+          <w:numId w:val="1007"/>
         </w:numPr>
         <w:pStyle w:val="Compact"/>
       </w:pPr>
@@ -5502,7 +6176,7 @@
       <w:pPr>
         <w:numPr>
           <w:ilvl w:val="0"/>
-          <w:numId w:val="1005"/>
+          <w:numId w:val="1007"/>
         </w:numPr>
         <w:pStyle w:val="Compact"/>
       </w:pPr>
@@ -5526,8 +6200,8 @@
         <w:t xml:space="preserve">separate from the right to buy the land. Because the land is not yet yours, a full application would need Certificate B with notice served on the Council as owner.</w:t>
       </w:r>
     </w:p>
-    <w:bookmarkEnd w:id="31"/>
-    <w:bookmarkStart w:id="32" w:name="options"/>
+    <w:bookmarkEnd w:id="36"/>
+    <w:bookmarkStart w:id="37" w:name="options"/>
     <w:p>
       <w:pPr>
         <w:pStyle w:val="Heading2"/>
@@ -5947,8 +6621,8 @@
         <w:t xml:space="preserve">Council’s Property Transactions team.</w:t>
       </w:r>
     </w:p>
-    <w:bookmarkEnd w:id="32"/>
-    <w:bookmarkStart w:id="33" w:name="Xc2d0e5589114d1ecffef592a0bfa283cacf020f"/>
+    <w:bookmarkEnd w:id="37"/>
+    <w:bookmarkStart w:id="38" w:name="Xc2d0e5589114d1ecffef592a0bfa283cacf020f"/>
     <w:p>
       <w:pPr>
         <w:pStyle w:val="Heading2"/>
@@ -6055,136 +6729,14 @@
         <w:t xml:space="preserve">precedent for a two-storey house of this size on a corner, but both belong in the street-scene analysis.</w:t>
       </w:r>
     </w:p>
-    <w:bookmarkEnd w:id="33"/>
-    <w:bookmarkStart w:id="34" w:name="occupancy-update-45-bedrooms"/>
+    <w:bookmarkEnd w:id="38"/>
+    <w:bookmarkStart w:id="39" w:name="occupancy-update-45-bedrooms"/>
     <w:p>
       <w:pPr>
         <w:pStyle w:val="Heading2"/>
       </w:pPr>
       <w:r>
         <w:t xml:space="preserve">Occupancy update: 4–5 bedrooms</w:t>
-      </w:r>
-    </w:p>
-    <w:p>
-      <w:pPr>
-        <w:numPr>
-          <w:ilvl w:val="0"/>
-          <w:numId w:val="1006"/>
-        </w:numPr>
-        <w:pStyle w:val="Compact"/>
-      </w:pPr>
-      <w:r>
-        <w:t xml:space="preserve">4b5p two-storey needs at least 97 m² GIA (about 49 m² per floor plus walls).</w:t>
-      </w:r>
-    </w:p>
-    <w:p>
-      <w:pPr>
-        <w:numPr>
-          <w:ilvl w:val="0"/>
-          <w:numId w:val="1006"/>
-        </w:numPr>
-        <w:pStyle w:val="Compact"/>
-      </w:pPr>
-      <w:r>
-        <w:t xml:space="preserve">Any five-bedroom type needs more than 4b5p; check the figures in the Nationally Described Space</w:t>
-      </w:r>
-      <w:r>
-        <w:t xml:space="preserve"> </w:t>
-      </w:r>
-      <w:r>
-        <w:t xml:space="preserve">Standard before quoting them.</w:t>
-      </w:r>
-    </w:p>
-    <w:p>
-      <w:pPr>
-        <w:numPr>
-          <w:ilvl w:val="0"/>
-          <w:numId w:val="1006"/>
-        </w:numPr>
-        <w:pStyle w:val="Compact"/>
-      </w:pPr>
-      <w:r>
-        <w:t xml:space="preserve">A larger house makes points 3–5 harder. Say plainly in the pre-application that this size is the</w:t>
-      </w:r>
-      <w:r>
-        <w:t xml:space="preserve"> </w:t>
-      </w:r>
-      <w:r>
-        <w:t xml:space="preserve">hardest case for the plot, and consider asking the officer about a three-bedroom alternative.</w:t>
-      </w:r>
-    </w:p>
-    <w:bookmarkEnd w:id="34"/>
-    <w:bookmarkStart w:id="35" w:name="Xb8407f5b6750d3fc1bfc9bb4509e557ba18bd8a"/>
-    <w:p>
-      <w:pPr>
-        <w:pStyle w:val="Heading2"/>
-      </w:pPr>
-      <w:r>
-        <w:t xml:space="preserve">No.1 side windows: rooms served (owner’s statement)</w:t>
-      </w:r>
-    </w:p>
-    <w:p>
-      <w:pPr>
-        <w:numPr>
-          <w:ilvl w:val="0"/>
-          <w:numId w:val="1007"/>
-        </w:numPr>
-        <w:pStyle w:val="Compact"/>
-      </w:pPr>
-      <w:r>
-        <w:t xml:space="preserve">Ground floor: kitchen. First floor: bedroom (the two-light window in the photo).</w:t>
-      </w:r>
-    </w:p>
-    <w:p>
-      <w:pPr>
-        <w:numPr>
-          <w:ilvl w:val="0"/>
-          <w:numId w:val="1007"/>
-        </w:numPr>
-        <w:pStyle w:val="Compact"/>
-      </w:pPr>
-      <w:r>
-        <w:t xml:space="preserve">BRE 209 counts kitchens and bedrooms as habitable rooms; living rooms, kitchens and bedrooms</w:t>
-      </w:r>
-      <w:r>
-        <w:t xml:space="preserve"> </w:t>
-      </w:r>
-      <w:r>
-        <w:t xml:space="preserve">carry more weight than bathrooms or landings. A kitchen’s daylight and a bedroom’s sunlight</w:t>
-      </w:r>
-      <w:r>
-        <w:t xml:space="preserve"> </w:t>
-      </w:r>
-      <w:r>
-        <w:t xml:space="preserve">are both tested.</w:t>
-      </w:r>
-    </w:p>
-    <w:p>
-      <w:pPr>
-        <w:numPr>
-          <w:ilvl w:val="0"/>
-          <w:numId w:val="1007"/>
-        </w:numPr>
-        <w:pStyle w:val="Compact"/>
-      </w:pPr>
-      <w:r>
-        <w:t xml:space="preserve">If either room has no other window, the side window is its only light, so the loss is more</w:t>
-      </w:r>
-      <w:r>
-        <w:t xml:space="preserve"> </w:t>
-      </w:r>
-      <w:r>
-        <w:t xml:space="preserve">significant. Photographs of each room’s windows are needed.</w:t>
-      </w:r>
-    </w:p>
-    <w:bookmarkEnd w:id="35"/>
-    <w:bookmarkStart w:id="36" w:name="Xd5d69b5bac90c50b8cf2786eccf4ceafa71145c"/>
-    <w:p>
-      <w:pPr>
-        <w:pStyle w:val="Heading2"/>
-      </w:pPr>
-      <w:r>
-        <w:t xml:space="preserve">Layout idea: house on the west (left) side of the plot</w:t>
       </w:r>
     </w:p>
     <w:p>
@@ -6196,25 +6748,7 @@
         <w:pStyle w:val="Compact"/>
       </w:pPr>
       <w:r>
-        <w:t xml:space="preserve">A house kept to the west of No.1’s gable is south-west, not directly south, of the side windows.</w:t>
-      </w:r>
-      <w:r>
-        <w:t xml:space="preserve"> </w:t>
-      </w:r>
-      <w:r>
-        <w:t xml:space="preserve">That helps the 25° and VSC tests, because the nearest part of the new wall is further from</w:t>
-      </w:r>
-      <w:r>
-        <w:t xml:space="preserve"> </w:t>
-      </w:r>
-      <w:r>
-        <w:t xml:space="preserve">the windows, but it does not remove the need to test. A south-west building can still cut</w:t>
-      </w:r>
-      <w:r>
-        <w:t xml:space="preserve"> </w:t>
-      </w:r>
-      <w:r>
-        <w:t xml:space="preserve">winter afternoon sun to south-facing windows (APSH test).</w:t>
+        <w:t xml:space="preserve">4b5p two-storey needs at least 97 m² GIA (about 49 m² per floor plus walls).</w:t>
       </w:r>
     </w:p>
     <w:p>
@@ -6226,13 +6760,13 @@
         <w:pStyle w:val="Compact"/>
       </w:pPr>
       <w:r>
-        <w:t xml:space="preserve">The kitchen has other light (living room and back door glazing), which lowers the weight of any loss</w:t>
-      </w:r>
-      <w:r>
-        <w:t xml:space="preserve"> </w:t>
-      </w:r>
-      <w:r>
-        <w:t xml:space="preserve">to the side window. Whether the bedroom has another window decides whether its loss is critical.</w:t>
+        <w:t xml:space="preserve">Any five-bedroom type needs more than 4b5p; check the figures in the Nationally Described Space</w:t>
+      </w:r>
+      <w:r>
+        <w:t xml:space="preserve"> </w:t>
+      </w:r>
+      <w:r>
+        <w:t xml:space="preserve">Standard before quoting them.</w:t>
       </w:r>
     </w:p>
     <w:p>
@@ -6244,47 +6778,23 @@
         <w:pStyle w:val="Compact"/>
       </w:pPr>
       <w:r>
-        <w:t xml:space="preserve">Side effects to test: the plot may be narrower at its west end, so check the buildable width and the</w:t>
-      </w:r>
-      <w:r>
-        <w:t xml:space="preserve"> </w:t>
-      </w:r>
-      <w:r>
-        <w:t xml:space="preserve">building line (point 4); then the effect on the neighbours on the left (privacy, overshadowing</w:t>
-      </w:r>
-      <w:r>
-        <w:t xml:space="preserve"> </w:t>
-      </w:r>
-      <w:r>
-        <w:t xml:space="preserve">of their back yards, side windows). A gap beside No.1 kept as garden or parking is a useful buffer.</w:t>
-      </w:r>
-    </w:p>
-    <w:p>
-      <w:pPr>
-        <w:numPr>
-          <w:ilvl w:val="0"/>
-          <w:numId w:val="1008"/>
-        </w:numPr>
-        <w:pStyle w:val="Compact"/>
-      </w:pPr>
-      <w:r>
-        <w:t xml:space="preserve">Draw the house in two positions on sheet 03 (west and centred) with the distance to No.1’s gable</w:t>
-      </w:r>
-      <w:r>
-        <w:t xml:space="preserve"> </w:t>
-      </w:r>
-      <w:r>
-        <w:t xml:space="preserve">dimensioned, then run sheet 13 on both.</w:t>
-      </w:r>
-    </w:p>
-    <w:bookmarkEnd w:id="36"/>
-    <w:bookmarkStart w:id="37" w:name="Xb102c2f4be2be8a26342dc2773caf08eae952ba"/>
+        <w:t xml:space="preserve">A larger house makes points 3–5 harder. Say plainly in the pre-application that this size is the</w:t>
+      </w:r>
+      <w:r>
+        <w:t xml:space="preserve"> </w:t>
+      </w:r>
+      <w:r>
+        <w:t xml:space="preserve">hardest case for the plot, and consider asking the officer about a three-bedroom alternative.</w:t>
+      </w:r>
+    </w:p>
+    <w:bookmarkEnd w:id="39"/>
+    <w:bookmarkStart w:id="40" w:name="Xb8407f5b6750d3fc1bfc9bb4509e557ba18bd8a"/>
     <w:p>
       <w:pPr>
         <w:pStyle w:val="Heading2"/>
       </w:pPr>
       <w:r>
-        <w:t xml:space="preserve">Update: the bedroom’s side window is its only window</w:t>
+        <w:t xml:space="preserve">No.1 side windows: rooms served (owner’s statement)</w:t>
       </w:r>
     </w:p>
     <w:p>
@@ -6296,25 +6806,7 @@
         <w:pStyle w:val="Compact"/>
       </w:pPr>
       <w:r>
-        <w:t xml:space="preserve">BRE 209 gives bedrooms less weight than living rooms and kitchens, and sunlight is mainly</w:t>
-      </w:r>
-      <w:r>
-        <w:t xml:space="preserve"> </w:t>
-      </w:r>
-      <w:r>
-        <w:t xml:space="preserve">tested for main living rooms. But with no other window, any loss of daylight to the bedroom is a</w:t>
-      </w:r>
-      <w:r>
-        <w:t xml:space="preserve"> </w:t>
-      </w:r>
-      <w:r>
-        <w:t xml:space="preserve">loss of all its light, so the VSC test and the room’s daylight distribution need to be</w:t>
-      </w:r>
-      <w:r>
-        <w:t xml:space="preserve"> </w:t>
-      </w:r>
-      <w:r>
-        <w:t xml:space="preserve">run and reported honestly.</w:t>
+        <w:t xml:space="preserve">Ground floor: kitchen. First floor: bedroom (the two-light window in the photo).</w:t>
       </w:r>
     </w:p>
     <w:p>
@@ -6326,35 +6818,47 @@
         <w:pStyle w:val="Compact"/>
       </w:pPr>
       <w:r>
-        <w:t xml:space="preserve">The design must keep the new house clear of the 25° line from the centre of this window, or show</w:t>
-      </w:r>
-      <w:r>
-        <w:t xml:space="preserve"> </w:t>
-      </w:r>
-      <w:r>
-        <w:t xml:space="preserve">by calculation that the loss is within BRE limits. If it cannot, reduce height, reduce the</w:t>
-      </w:r>
-      <w:r>
-        <w:t xml:space="preserve"> </w:t>
-      </w:r>
-      <w:r>
-        <w:t xml:space="preserve">footprint, or increase the gap. Alternatively, the owner could add or change a window to this</w:t>
-      </w:r>
-      <w:r>
-        <w:t xml:space="preserve"> </w:t>
-      </w:r>
-      <w:r>
-        <w:t xml:space="preserve">bedroom (check permitted development and any Article 4 direction).</w:t>
-      </w:r>
-    </w:p>
-    <w:bookmarkEnd w:id="37"/>
-    <w:bookmarkStart w:id="38" w:name="decision-4-bedrooms"/>
+        <w:t xml:space="preserve">BRE 209 counts kitchens and bedrooms as habitable rooms; living rooms, kitchens and bedrooms</w:t>
+      </w:r>
+      <w:r>
+        <w:t xml:space="preserve"> </w:t>
+      </w:r>
+      <w:r>
+        <w:t xml:space="preserve">carry more weight than bathrooms or landings. A kitchen’s daylight and a bedroom’s sunlight</w:t>
+      </w:r>
+      <w:r>
+        <w:t xml:space="preserve"> </w:t>
+      </w:r>
+      <w:r>
+        <w:t xml:space="preserve">are both tested.</w:t>
+      </w:r>
+    </w:p>
+    <w:p>
+      <w:pPr>
+        <w:numPr>
+          <w:ilvl w:val="0"/>
+          <w:numId w:val="1009"/>
+        </w:numPr>
+        <w:pStyle w:val="Compact"/>
+      </w:pPr>
+      <w:r>
+        <w:t xml:space="preserve">If either room has no other window, the side window is its only light, so the loss is more</w:t>
+      </w:r>
+      <w:r>
+        <w:t xml:space="preserve"> </w:t>
+      </w:r>
+      <w:r>
+        <w:t xml:space="preserve">significant. Photographs of each room’s windows are needed.</w:t>
+      </w:r>
+    </w:p>
+    <w:bookmarkEnd w:id="40"/>
+    <w:bookmarkStart w:id="41" w:name="Xd5d69b5bac90c50b8cf2786eccf4ceafa71145c"/>
     <w:p>
       <w:pPr>
         <w:pStyle w:val="Heading2"/>
       </w:pPr>
       <w:r>
-        <w:t xml:space="preserve">Decision: 4 bedrooms</w:t>
+        <w:t xml:space="preserve">Layout idea: house on the west (left) side of the plot</w:t>
       </w:r>
     </w:p>
     <w:p>
@@ -6366,7 +6870,25 @@
         <w:pStyle w:val="Compact"/>
       </w:pPr>
       <w:r>
-        <w:t xml:space="preserve">4b5p two-storey: at least 97 m² GIA, about 49 m² per floor plus walls. 4b6p: 106 m².</w:t>
+        <w:t xml:space="preserve">A house kept to the west of No.1’s gable is south-west, not directly south, of the side windows.</w:t>
+      </w:r>
+      <w:r>
+        <w:t xml:space="preserve"> </w:t>
+      </w:r>
+      <w:r>
+        <w:t xml:space="preserve">That helps the 25° and VSC tests, because the nearest part of the new wall is further from</w:t>
+      </w:r>
+      <w:r>
+        <w:t xml:space="preserve"> </w:t>
+      </w:r>
+      <w:r>
+        <w:t xml:space="preserve">the windows, but it does not remove the need to test. A south-west building can still cut</w:t>
+      </w:r>
+      <w:r>
+        <w:t xml:space="preserve"> </w:t>
+      </w:r>
+      <w:r>
+        <w:t xml:space="preserve">winter afternoon sun to south-facing windows (APSH test).</w:t>
       </w:r>
     </w:p>
     <w:p>
@@ -6378,25 +6900,13 @@
         <w:pStyle w:val="Compact"/>
       </w:pPr>
       <w:r>
-        <w:t xml:space="preserve">Test this first: 4 bedrooms on the west side of the plot, lower ridge, building line from the survey, a</w:t>
-      </w:r>
-      <w:r>
-        <w:t xml:space="preserve"> </w:t>
-      </w:r>
-      <w:r>
-        <w:t xml:space="preserve">gap beside No.1. Three outcomes after survey and tests: it fits and passes (go to the</w:t>
-      </w:r>
-      <w:r>
-        <w:t xml:space="preserve"> </w:t>
-      </w:r>
-      <w:r>
-        <w:t xml:space="preserve">second pre-application); it fits but fails sheet 13 (lower the ridge or reduce footprint); it will</w:t>
-      </w:r>
-      <w:r>
-        <w:t xml:space="preserve"> </w:t>
-      </w:r>
-      <w:r>
-        <w:t xml:space="preserve">not fit the west end at the building line (fall back to Option B, a 2–3 bed house).</w:t>
+        <w:t xml:space="preserve">The kitchen has other light (living room and back door glazing), which lowers the weight of any loss</w:t>
+      </w:r>
+      <w:r>
+        <w:t xml:space="preserve"> </w:t>
+      </w:r>
+      <w:r>
+        <w:t xml:space="preserve">to the side window. Whether the bedroom has another window decides whether its loss is critical.</w:t>
       </w:r>
     </w:p>
     <w:p>
@@ -6408,17 +6918,47 @@
         <w:pStyle w:val="Compact"/>
       </w:pPr>
       <w:r>
-        <w:t xml:space="preserve">Tell the officer plainly that the four-bedroom house is the hardest case for points 3–5.</w:t>
-      </w:r>
-    </w:p>
-    <w:bookmarkEnd w:id="38"/>
-    <w:bookmarkStart w:id="39" w:name="X658e5deabcc706ca0a91c134252db7ecacca4d8"/>
+        <w:t xml:space="preserve">Side effects to test: the plot may be narrower at its west end, so check the buildable width and the</w:t>
+      </w:r>
+      <w:r>
+        <w:t xml:space="preserve"> </w:t>
+      </w:r>
+      <w:r>
+        <w:t xml:space="preserve">building line (point 4); then the effect on the neighbours on the left (privacy, overshadowing</w:t>
+      </w:r>
+      <w:r>
+        <w:t xml:space="preserve"> </w:t>
+      </w:r>
+      <w:r>
+        <w:t xml:space="preserve">of their back yards, side windows). A gap beside No.1 kept as garden or parking is a useful buffer.</w:t>
+      </w:r>
+    </w:p>
+    <w:p>
+      <w:pPr>
+        <w:numPr>
+          <w:ilvl w:val="0"/>
+          <w:numId w:val="1010"/>
+        </w:numPr>
+        <w:pStyle w:val="Compact"/>
+      </w:pPr>
+      <w:r>
+        <w:t xml:space="preserve">Draw the house in two positions on sheet 03 (west and centred) with the distance to No.1’s gable</w:t>
+      </w:r>
+      <w:r>
+        <w:t xml:space="preserve"> </w:t>
+      </w:r>
+      <w:r>
+        <w:t xml:space="preserve">dimensioned, then run sheet 13 on both.</w:t>
+      </w:r>
+    </w:p>
+    <w:bookmarkEnd w:id="41"/>
+    <w:bookmarkStart w:id="42" w:name="Xb102c2f4be2be8a26342dc2773caf08eae952ba"/>
     <w:p>
       <w:pPr>
         <w:pStyle w:val="Heading2"/>
       </w:pPr>
       <w:r>
-        <w:t xml:space="preserve">Using No.1’s back yard (to the west) for the house</w:t>
+        <w:t xml:space="preserve">Update: the bedroom’s side window is its only window</w:t>
       </w:r>
     </w:p>
     <w:p>
@@ -6430,13 +6970,25 @@
         <w:pStyle w:val="Compact"/>
       </w:pPr>
       <w:r>
-        <w:t xml:space="preserve">Benefit: more width and depth than the shallow plot, which may let a 4-bedroom house fit</w:t>
-      </w:r>
-      <w:r>
-        <w:t xml:space="preserve"> </w:t>
-      </w:r>
-      <w:r>
-        <w:t xml:space="preserve">at the building line.</w:t>
+        <w:t xml:space="preserve">BRE 209 gives bedrooms less weight than living rooms and kitchens, and sunlight is mainly</w:t>
+      </w:r>
+      <w:r>
+        <w:t xml:space="preserve"> </w:t>
+      </w:r>
+      <w:r>
+        <w:t xml:space="preserve">tested for main living rooms. But with no other window, any loss of daylight to the bedroom is a</w:t>
+      </w:r>
+      <w:r>
+        <w:t xml:space="preserve"> </w:t>
+      </w:r>
+      <w:r>
+        <w:t xml:space="preserve">loss of all its light, so the VSC test and the room’s daylight distribution need to be</w:t>
+      </w:r>
+      <w:r>
+        <w:t xml:space="preserve"> </w:t>
+      </w:r>
+      <w:r>
+        <w:t xml:space="preserve">run and reported honestly.</w:t>
       </w:r>
     </w:p>
     <w:p>
@@ -6448,113 +7000,35 @@
         <w:pStyle w:val="Compact"/>
       </w:pPr>
       <w:r>
-        <w:t xml:space="preserve">Risk 1 (important): No.1’s rear faces west onto that yard. The kitchen’s other light (back door</w:t>
-      </w:r>
-      <w:r>
-        <w:t xml:space="preserve"> </w:t>
-      </w:r>
-      <w:r>
-        <w:t xml:space="preserve">glazing) and the living room windows face it. Building there could cut the light that made the</w:t>
-      </w:r>
-      <w:r>
-        <w:t xml:space="preserve"> </w:t>
-      </w:r>
-      <w:r>
-        <w:t xml:space="preserve">kitchen acceptable. So test the rear windows as well as the two side windows, and keep the house</w:t>
-      </w:r>
-      <w:r>
-        <w:t xml:space="preserve"> </w:t>
-      </w:r>
-      <w:r>
-        <w:t xml:space="preserve">clear of the 25° line from each.</w:t>
-      </w:r>
-    </w:p>
-    <w:p>
-      <w:pPr>
-        <w:numPr>
-          <w:ilvl w:val="0"/>
-          <w:numId w:val="1011"/>
-        </w:numPr>
-        <w:pStyle w:val="Compact"/>
-      </w:pPr>
-      <w:r>
-        <w:t xml:space="preserve">Risk 2: the officer may treat it as garden/backland development. Check the NPPF policy on residential</w:t>
-      </w:r>
-      <w:r>
-        <w:t xml:space="preserve"> </w:t>
-      </w:r>
-      <w:r>
-        <w:t xml:space="preserve">gardens and the Manchester guidance (wording not verified), and the privacy distances between the</w:t>
-      </w:r>
-      <w:r>
-        <w:t xml:space="preserve"> </w:t>
-      </w:r>
-      <w:r>
-        <w:t xml:space="preserve">new house and No.1’s rear windows. Keep a usable garden for No.1 (2-bed house; size</w:t>
-      </w:r>
-      <w:r>
-        <w:t xml:space="preserve"> </w:t>
-      </w:r>
-      <w:r>
-        <w:t xml:space="preserve">[TO BE CONFIRMED against Council guidance]).</w:t>
-      </w:r>
-    </w:p>
-    <w:p>
-      <w:pPr>
-        <w:numPr>
-          <w:ilvl w:val="0"/>
-          <w:numId w:val="1011"/>
-        </w:numPr>
-        <w:pStyle w:val="Compact"/>
-      </w:pPr>
-      <w:r>
-        <w:t xml:space="preserve">Risk 3: the red line must then include part of your own garden. Certificate A applies to land you</w:t>
-      </w:r>
-      <w:r>
-        <w:t xml:space="preserve"> </w:t>
-      </w:r>
-      <w:r>
-        <w:t xml:space="preserve">own, B to the Council’s plot; both parts need to be shown on the location plan.</w:t>
-      </w:r>
-    </w:p>
-    <w:p>
-      <w:pPr>
-        <w:numPr>
-          <w:ilvl w:val="0"/>
-          <w:numId w:val="1011"/>
-        </w:numPr>
-        <w:pStyle w:val="Compact"/>
-      </w:pPr>
-      <w:r>
-        <w:t xml:space="preserve">Neighbours west of the yard (the gardens and houses beyond) need their privacy and light checked.</w:t>
-      </w:r>
-    </w:p>
-    <w:p>
-      <w:pPr>
-        <w:numPr>
-          <w:ilvl w:val="0"/>
-          <w:numId w:val="1011"/>
-        </w:numPr>
-        <w:pStyle w:val="Compact"/>
-      </w:pPr>
-      <w:r>
-        <w:t xml:space="preserve">Add to the drawing schedule: sheet 12 to include the rear elevation of No.1, and sheets 02-03 to</w:t>
-      </w:r>
-      <w:r>
-        <w:t xml:space="preserve"> </w:t>
-      </w:r>
-      <w:r>
-        <w:t xml:space="preserve">show the extended red line and No.1’s remaining garden.</w:t>
-      </w:r>
-    </w:p>
-    <w:bookmarkEnd w:id="39"/>
-    <w:bookmarkStart w:id="40" w:name="X4b58d018bb7b6511e05426047aad56d6185b5c4"/>
+        <w:t xml:space="preserve">The design must keep the new house clear of the 25° line from the centre of this window, or show</w:t>
+      </w:r>
+      <w:r>
+        <w:t xml:space="preserve"> </w:t>
+      </w:r>
+      <w:r>
+        <w:t xml:space="preserve">by calculation that the loss is within BRE limits. If it cannot, reduce height, reduce the</w:t>
+      </w:r>
+      <w:r>
+        <w:t xml:space="preserve"> </w:t>
+      </w:r>
+      <w:r>
+        <w:t xml:space="preserve">footprint, or increase the gap. Alternatively, the owner could add or change a window to this</w:t>
+      </w:r>
+      <w:r>
+        <w:t xml:space="preserve"> </w:t>
+      </w:r>
+      <w:r>
+        <w:t xml:space="preserve">bedroom (check permitted development and any Article 4 direction).</w:t>
+      </w:r>
+    </w:p>
+    <w:bookmarkEnd w:id="42"/>
+    <w:bookmarkStart w:id="43" w:name="decision-4-bedrooms"/>
     <w:p>
       <w:pPr>
         <w:pStyle w:val="Heading2"/>
       </w:pPr>
       <w:r>
-        <w:t xml:space="preserve">Street View screenshot (Aug 2025) – hedge and wall</w:t>
+        <w:t xml:space="preserve">Decision: 4 bedrooms</w:t>
       </w:r>
     </w:p>
     <w:p>
@@ -6566,22 +7040,7 @@
         <w:pStyle w:val="Compact"/>
       </w:pPr>
       <w:r>
-        <w:t xml:space="preserve">Shows a very tall, dense evergreen hedge on top of an old low brick wall, with the end of a house</w:t>
-      </w:r>
-      <w:r>
-        <w:t xml:space="preserve"> </w:t>
-      </w:r>
-      <w:r>
-        <w:t xml:space="preserve">behind on the left. Height, ownership, species and the viewpoint are not known (</w:t>
-      </w:r>
-      <w:r>
-        <w:rPr>
-          <w:rStyle w:val="VerbatimChar"/>
-        </w:rPr>
-        <w:t xml:space="preserve">[TO BE SURVEYED]</w:t>
-      </w:r>
-      <w:r>
-        <w:t xml:space="preserve">).</w:t>
+        <w:t xml:space="preserve">4b5p two-storey: at least 97 m² GIA, about 49 m² per floor plus walls. 4b6p: 106 m².</w:t>
       </w:r>
     </w:p>
     <w:p>
@@ -6593,28 +7052,25 @@
         <w:pStyle w:val="Compact"/>
       </w:pPr>
       <w:r>
-        <w:t xml:space="preserve">Google labels the house shown</w:t>
-      </w:r>
-      <w:r>
-        <w:t xml:space="preserve"> </w:t>
-      </w:r>
-      <w:r>
-        <w:t xml:space="preserve">“</w:t>
-      </w:r>
-      <w:r>
-        <w:t xml:space="preserve">3 Cleethorpes Ave</w:t>
-      </w:r>
-      <w:r>
-        <w:t xml:space="preserve">”</w:t>
-      </w:r>
-      <w:r>
-        <w:t xml:space="preserve">. Google labels are unreliable, but confirm from</w:t>
-      </w:r>
-      <w:r>
-        <w:t xml:space="preserve"> </w:t>
-      </w:r>
-      <w:r>
-        <w:t xml:space="preserve">title and the Council that the house beside the plot is No.1.</w:t>
+        <w:t xml:space="preserve">Test this first: 4 bedrooms on the west side of the plot, lower ridge, building line from the survey, a</w:t>
+      </w:r>
+      <w:r>
+        <w:t xml:space="preserve"> </w:t>
+      </w:r>
+      <w:r>
+        <w:t xml:space="preserve">gap beside No.1. Three outcomes after survey and tests: it fits and passes (go to the</w:t>
+      </w:r>
+      <w:r>
+        <w:t xml:space="preserve"> </w:t>
+      </w:r>
+      <w:r>
+        <w:t xml:space="preserve">second pre-application); it fits but fails sheet 13 (lower the ridge or reduce footprint); it will</w:t>
+      </w:r>
+      <w:r>
+        <w:t xml:space="preserve"> </w:t>
+      </w:r>
+      <w:r>
+        <w:t xml:space="preserve">not fit the west end at the building line (fall back to Option B, a 2–3 bed house).</w:t>
       </w:r>
     </w:p>
     <w:p>
@@ -6626,242 +7082,17 @@
         <w:pStyle w:val="Compact"/>
       </w:pPr>
       <w:r>
-        <w:t xml:space="preserve">BRE 209 normally ignores trees and hedges, so the daylight baseline will probably be taken as if</w:t>
-      </w:r>
-      <w:r>
-        <w:t xml:space="preserve"> </w:t>
-      </w:r>
-      <w:r>
-        <w:t xml:space="preserve">the hedge were not there. Do not argue that the hedge already blocks light to the kitchen window.</w:t>
-      </w:r>
-    </w:p>
-    <w:p>
-      <w:pPr>
-        <w:numPr>
-          <w:ilvl w:val="0"/>
-          <w:numId w:val="1012"/>
-        </w:numPr>
-        <w:pStyle w:val="Compact"/>
-      </w:pPr>
-      <w:r>
-        <w:t xml:space="preserve">If the hedge is removed for the house: add it to the tree/hedge survey (sheet 17), the biodiversity</w:t>
-      </w:r>
-      <w:r>
-        <w:t xml:space="preserve"> </w:t>
-      </w:r>
-      <w:r>
-        <w:t xml:space="preserve">net gain baseline and a nesting-bird check. If it is kept, it may restrict where the house can go.</w:t>
-      </w:r>
-    </w:p>
-    <w:p>
-      <w:pPr>
-        <w:numPr>
-          <w:ilvl w:val="0"/>
-          <w:numId w:val="1012"/>
-        </w:numPr>
-        <w:pStyle w:val="Compact"/>
-      </w:pPr>
-      <w:r>
-        <w:t xml:space="preserve">The old brick wall may be a retaining wall; check its condition and who owns it.</w:t>
-      </w:r>
-    </w:p>
-    <w:bookmarkEnd w:id="40"/>
-    <w:bookmarkStart w:id="41" w:name="Xba6499f94da26e83058623fe6b999ee27bf74ef"/>
+        <w:t xml:space="preserve">Tell the officer plainly that the four-bedroom house is the hardest case for points 3–5.</w:t>
+      </w:r>
+    </w:p>
+    <w:bookmarkEnd w:id="43"/>
+    <w:bookmarkStart w:id="44" w:name="X658e5deabcc706ca0a91c134252db7ecacca4d8"/>
     <w:p>
       <w:pPr>
         <w:pStyle w:val="Heading2"/>
       </w:pPr>
       <w:r>
-        <w:t xml:space="preserve">Street View screenshot from Sandyhill Road (Aug 2025, labelled</w:t>
-      </w:r>
-      <w:r>
-        <w:t xml:space="preserve"> </w:t>
-      </w:r>
-      <w:r>
-        <w:t xml:space="preserve">“</w:t>
-      </w:r>
-      <w:r>
-        <w:t xml:space="preserve">113 Sandyhill Rd</w:t>
-      </w:r>
-      <w:r>
-        <w:t xml:space="preserve">”</w:t>
-      </w:r>
-      <w:r>
-        <w:t xml:space="preserve">)</w:t>
-      </w:r>
-    </w:p>
-    <w:p>
-      <w:pPr>
-        <w:pStyle w:val="FirstParagraph"/>
-      </w:pPr>
-      <w:r>
-        <w:t xml:space="preserve">Qualitative only; no dimensions are read from it.</w:t>
-      </w:r>
-      <w:r>
-        <w:t xml:space="preserve"> </w:t>
-      </w:r>
-      <w:r>
-        <w:t xml:space="preserve">- Plot: a grass bank behind a low brick wall with a brick-on-edge coping; the ground appears to rise</w:t>
-      </w:r>
-      <w:r>
-        <w:t xml:space="preserve"> </w:t>
-      </w:r>
-      <w:r>
-        <w:t xml:space="preserve">from the wall towards the back of the plot. This supports the officer’s point 3. The wall steps</w:t>
-      </w:r>
-      <w:r>
-        <w:t xml:space="preserve"> </w:t>
-      </w:r>
-      <w:r>
-        <w:t xml:space="preserve">down along the kerb as the road falls towards Cleethorpes Avenue.</w:t>
-      </w:r>
-      <w:r>
-        <w:t xml:space="preserve"> </w:t>
-      </w:r>
-      <w:r>
-        <w:t xml:space="preserve">- A street light column stands in front of the wall. It affects where a driveway or dropped kerb</w:t>
-      </w:r>
-      <w:r>
-        <w:t xml:space="preserve"> </w:t>
-      </w:r>
-      <w:r>
-        <w:t xml:space="preserve">could go (highways to confirm the cost and the Council’s consent to move it).</w:t>
-      </w:r>
-      <w:r>
-        <w:t xml:space="preserve"> </w:t>
-      </w:r>
-      <w:r>
-        <w:t xml:space="preserve">- A timber fence and shrubs mark the west (left) end of the plot; the boundary owner is unknown.</w:t>
-      </w:r>
-      <w:r>
-        <w:t xml:space="preserve"> </w:t>
-      </w:r>
-      <w:r>
-        <w:t xml:space="preserve">- The gable of the house behind shows the two-light first-floor window and a ground-floor</w:t>
-      </w:r>
-      <w:r>
-        <w:t xml:space="preserve"> </w:t>
-      </w:r>
-      <w:r>
-        <w:t xml:space="preserve">window partly behind shrubs, consistent with the owner’s statement.</w:t>
-      </w:r>
-      <w:r>
-        <w:t xml:space="preserve"> </w:t>
-      </w:r>
-      <w:r>
-        <w:t xml:space="preserve">- Character (point 6): neighbouring houses are two-storey red brick with pitched roofs and some</w:t>
-      </w:r>
-      <w:r>
-        <w:t xml:space="preserve"> </w:t>
-      </w:r>
-      <w:r>
-        <w:t xml:space="preserve">gable ends facing the street, so a brick, pitched-roof house is consistent with the area. Record</w:t>
-      </w:r>
-      <w:r>
-        <w:t xml:space="preserve"> </w:t>
-      </w:r>
-      <w:r>
-        <w:t xml:space="preserve">roof pitch, eaves and ridge heights, and set-backs from the survey.</w:t>
-      </w:r>
-    </w:p>
-    <w:bookmarkEnd w:id="41"/>
-    <w:bookmarkStart w:id="42" w:name="X9070192514834c408ada202f1e664c3a4f5f045"/>
-    <w:p>
-      <w:pPr>
-        <w:pStyle w:val="Heading2"/>
-      </w:pPr>
-      <w:r>
-        <w:t xml:space="preserve">Street View screenshot looking along Sandyhill Road (building line)</w:t>
-      </w:r>
-    </w:p>
-    <w:p>
-      <w:pPr>
-        <w:pStyle w:val="FirstParagraph"/>
-      </w:pPr>
-      <w:r>
-        <w:t xml:space="preserve">Qualitative only; the survey must measure everything.</w:t>
-      </w:r>
-      <w:r>
-        <w:t xml:space="preserve"> </w:t>
-      </w:r>
-      <w:r>
-        <w:t xml:space="preserve">- The houses on the left (west of the plot) are two-storey semi-detached, brick and render, with</w:t>
-      </w:r>
-      <w:r>
-        <w:t xml:space="preserve"> </w:t>
-      </w:r>
-      <w:r>
-        <w:t xml:space="preserve">pitched roofs and solar panels. Their fronts are set back from the footway behind raised front</w:t>
-      </w:r>
-      <w:r>
-        <w:t xml:space="preserve"> </w:t>
-      </w:r>
-      <w:r>
-        <w:t xml:space="preserve">gardens and a low brick wall. The plot’s frontage wall continues the same wall line.</w:t>
-      </w:r>
-      <w:r>
-        <w:t xml:space="preserve"> </w:t>
-      </w:r>
-      <w:r>
-        <w:t xml:space="preserve">- This supports the officer’s point 4: a house built near the plot’s wall would stand well forward of</w:t>
-      </w:r>
-      <w:r>
-        <w:t xml:space="preserve"> </w:t>
-      </w:r>
-      <w:r>
-        <w:t xml:space="preserve">those fronts. Aligning with them pushes the house back up the bank, so the buildable depth, the</w:t>
-      </w:r>
-      <w:r>
-        <w:t xml:space="preserve"> </w:t>
-      </w:r>
-      <w:r>
-        <w:t xml:space="preserve">cut and the retaining wall all increase (points 3 and 4 interact). A 4-bedroom house may not fit.</w:t>
-      </w:r>
-      <w:r>
-        <w:t xml:space="preserve"> </w:t>
-      </w:r>
-      <w:r>
-        <w:t xml:space="preserve">- A large shrub sits on the boundary with the west neighbour, and a timber fence stands at the back of</w:t>
-      </w:r>
-      <w:r>
-        <w:t xml:space="preserve"> </w:t>
-      </w:r>
-      <w:r>
-        <w:t xml:space="preserve">the plot. Ownership is unknown.</w:t>
-      </w:r>
-      <w:r>
-        <w:t xml:space="preserve"> </w:t>
-      </w:r>
-      <w:r>
-        <w:t xml:space="preserve">- The addresses of the west neighbours need confirming. The Street View label (113 Sandyhill Rd) does</w:t>
-      </w:r>
-      <w:r>
-        <w:t xml:space="preserve"> </w:t>
-      </w:r>
-      <w:r>
-        <w:t xml:space="preserve">not match the house numbers on the aerial (56, 58, 60).</w:t>
-      </w:r>
-      <w:r>
-        <w:t xml:space="preserve"> </w:t>
-      </w:r>
-      <w:r>
-        <w:t xml:space="preserve">- For the street scene (point 6): the neighbours’ ridge and eaves heights and the front garden levels</w:t>
-      </w:r>
-      <w:r>
-        <w:t xml:space="preserve"> </w:t>
-      </w:r>
-      <w:r>
-        <w:t xml:space="preserve">must be surveyed so the new house can be drawn to scale beside them.</w:t>
-      </w:r>
-    </w:p>
-    <w:bookmarkEnd w:id="42"/>
-    <w:bookmarkStart w:id="43" w:name="X9d1c10a08038de196895fc0fe663d5fed560065"/>
-    <w:p>
-      <w:pPr>
-        <w:pStyle w:val="Heading2"/>
-      </w:pPr>
-      <w:r>
-        <w:t xml:space="preserve">What the photos show of No.1’s windows (visual reading only)</w:t>
+        <w:t xml:space="preserve">Using No.1’s back yard (to the west) for the house</w:t>
       </w:r>
     </w:p>
     <w:p>
@@ -6873,19 +7104,13 @@
         <w:pStyle w:val="Compact"/>
       </w:pPr>
       <w:r>
-        <w:t xml:space="preserve">Two windows are stacked one above the other on the gable: a two-light window at first floor and a</w:t>
-      </w:r>
-      <w:r>
-        <w:t xml:space="preserve"> </w:t>
-      </w:r>
-      <w:r>
-        <w:t xml:space="preserve">ground-floor window directly below it, partly hidden by shrubs. This matches the owner’s statement</w:t>
-      </w:r>
-      <w:r>
-        <w:t xml:space="preserve"> </w:t>
-      </w:r>
-      <w:r>
-        <w:t xml:space="preserve">(bedroom above, kitchen below).</w:t>
+        <w:t xml:space="preserve">Benefit: more width and depth than the shallow plot, which may let a 4-bedroom house fit</w:t>
+      </w:r>
+      <w:r>
+        <w:t xml:space="preserve"> </w:t>
+      </w:r>
+      <w:r>
+        <w:t xml:space="preserve">at the building line.</w:t>
       </w:r>
     </w:p>
     <w:p>
@@ -6897,13 +7122,25 @@
         <w:pStyle w:val="Compact"/>
       </w:pPr>
       <w:r>
-        <w:t xml:space="preserve">A smaller window appears near the left corner of the gable in the Street View images. Its room is</w:t>
-      </w:r>
-      <w:r>
-        <w:t xml:space="preserve"> </w:t>
-      </w:r>
-      <w:r>
-        <w:t xml:space="preserve">unknown (possibly stairs or landing); ask the owner.</w:t>
+        <w:t xml:space="preserve">Risk 1 (important): No.1’s rear faces west onto that yard. The kitchen’s other light (back door</w:t>
+      </w:r>
+      <w:r>
+        <w:t xml:space="preserve"> </w:t>
+      </w:r>
+      <w:r>
+        <w:t xml:space="preserve">glazing) and the living room windows face it. Building there could cut the light that made the</w:t>
+      </w:r>
+      <w:r>
+        <w:t xml:space="preserve"> </w:t>
+      </w:r>
+      <w:r>
+        <w:t xml:space="preserve">kitchen acceptable. So test the rear windows as well as the two side windows, and keep the house</w:t>
+      </w:r>
+      <w:r>
+        <w:t xml:space="preserve"> </w:t>
+      </w:r>
+      <w:r>
+        <w:t xml:space="preserve">clear of the 25° line from each.</w:t>
       </w:r>
     </w:p>
     <w:p>
@@ -6915,29 +7152,83 @@
         <w:pStyle w:val="Compact"/>
       </w:pPr>
       <w:r>
-        <w:t xml:space="preserve">Sizes and heights cannot be taken from these photos because of perspective and the shrubs. Use the</w:t>
-      </w:r>
-      <w:r>
-        <w:t xml:space="preserve"> </w:t>
-      </w:r>
-      <w:r>
-        <w:t xml:space="preserve">surveyor’s measurements. A straight-on photo of the gable from the footway, with a tape or</w:t>
-      </w:r>
-      <w:r>
-        <w:t xml:space="preserve"> </w:t>
-      </w:r>
-      <w:r>
-        <w:t xml:space="preserve">a 1 m rule held against the wall, would let the surveyor check the sizes quickly.</w:t>
-      </w:r>
-    </w:p>
-    <w:bookmarkEnd w:id="43"/>
-    <w:bookmarkStart w:id="44" w:name="X15eb879c7cfaeade40e490435f26eb621189b4f"/>
+        <w:t xml:space="preserve">Risk 2: the officer may treat it as garden/backland development. Check the NPPF policy on residential</w:t>
+      </w:r>
+      <w:r>
+        <w:t xml:space="preserve"> </w:t>
+      </w:r>
+      <w:r>
+        <w:t xml:space="preserve">gardens and the Manchester guidance (wording not verified), and the privacy distances between the</w:t>
+      </w:r>
+      <w:r>
+        <w:t xml:space="preserve"> </w:t>
+      </w:r>
+      <w:r>
+        <w:t xml:space="preserve">new house and No.1’s rear windows. Keep a usable garden for No.1 (2-bed house; size</w:t>
+      </w:r>
+      <w:r>
+        <w:t xml:space="preserve"> </w:t>
+      </w:r>
+      <w:r>
+        <w:t xml:space="preserve">[TO BE CONFIRMED against Council guidance]).</w:t>
+      </w:r>
+    </w:p>
+    <w:p>
+      <w:pPr>
+        <w:numPr>
+          <w:ilvl w:val="0"/>
+          <w:numId w:val="1013"/>
+        </w:numPr>
+        <w:pStyle w:val="Compact"/>
+      </w:pPr>
+      <w:r>
+        <w:t xml:space="preserve">Risk 3: the red line must then include part of your own garden. Certificate A applies to land you</w:t>
+      </w:r>
+      <w:r>
+        <w:t xml:space="preserve"> </w:t>
+      </w:r>
+      <w:r>
+        <w:t xml:space="preserve">own, B to the Council’s plot; both parts need to be shown on the location plan.</w:t>
+      </w:r>
+    </w:p>
+    <w:p>
+      <w:pPr>
+        <w:numPr>
+          <w:ilvl w:val="0"/>
+          <w:numId w:val="1013"/>
+        </w:numPr>
+        <w:pStyle w:val="Compact"/>
+      </w:pPr>
+      <w:r>
+        <w:t xml:space="preserve">Neighbours west of the yard (the gardens and houses beyond) need their privacy and light checked.</w:t>
+      </w:r>
+    </w:p>
+    <w:p>
+      <w:pPr>
+        <w:numPr>
+          <w:ilvl w:val="0"/>
+          <w:numId w:val="1013"/>
+        </w:numPr>
+        <w:pStyle w:val="Compact"/>
+      </w:pPr>
+      <w:r>
+        <w:t xml:space="preserve">Add to the drawing schedule: sheet 12 to include the rear elevation of No.1, and sheets 02-03 to</w:t>
+      </w:r>
+      <w:r>
+        <w:t xml:space="preserve"> </w:t>
+      </w:r>
+      <w:r>
+        <w:t xml:space="preserve">show the extended red line and No.1’s remaining garden.</w:t>
+      </w:r>
+    </w:p>
+    <w:bookmarkEnd w:id="44"/>
+    <w:bookmarkStart w:id="45" w:name="X4b58d018bb7b6511e05426047aad56d6185b5c4"/>
     <w:p>
       <w:pPr>
         <w:pStyle w:val="Heading2"/>
       </w:pPr>
       <w:r>
-        <w:t xml:space="preserve">Garden between No.1’s gable and the timber fence (owner’s statement)</w:t>
+        <w:t xml:space="preserve">Street View screenshot (Aug 2025) – hedge and wall</w:t>
       </w:r>
     </w:p>
     <w:p>
@@ -6949,13 +7240,22 @@
         <w:pStyle w:val="Compact"/>
       </w:pPr>
       <w:r>
-        <w:t xml:space="preserve">The photos show a timber fence at the back of the plot, near No.1’s gable. The owner says the</w:t>
-      </w:r>
-      <w:r>
-        <w:t xml:space="preserve"> </w:t>
-      </w:r>
-      <w:r>
-        <w:t xml:space="preserve">garden of No.1 runs from the end of the house to that fence and that this length can be used for the house.</w:t>
+        <w:t xml:space="preserve">Shows a very tall, dense evergreen hedge on top of an old low brick wall, with the end of a house</w:t>
+      </w:r>
+      <w:r>
+        <w:t xml:space="preserve"> </w:t>
+      </w:r>
+      <w:r>
+        <w:t xml:space="preserve">behind on the left. Height, ownership, species and the viewpoint are not known (</w:t>
+      </w:r>
+      <w:r>
+        <w:rPr>
+          <w:rStyle w:val="VerbatimChar"/>
+        </w:rPr>
+        <w:t xml:space="preserve">[TO BE SURVEYED]</w:t>
+      </w:r>
+      <w:r>
+        <w:t xml:space="preserve">).</w:t>
       </w:r>
     </w:p>
     <w:p>
@@ -6967,13 +7267,28 @@
         <w:pStyle w:val="Compact"/>
       </w:pPr>
       <w:r>
-        <w:t xml:space="preserve">A fence is not proof of the legal boundary. Get the Land Registry title plan for No.1 and have the</w:t>
-      </w:r>
-      <w:r>
-        <w:t xml:space="preserve"> </w:t>
-      </w:r>
-      <w:r>
-        <w:t xml:space="preserve">surveyor plot it with the Council’s plot.</w:t>
+        <w:t xml:space="preserve">Google labels the house shown</w:t>
+      </w:r>
+      <w:r>
+        <w:t xml:space="preserve"> </w:t>
+      </w:r>
+      <w:r>
+        <w:t xml:space="preserve">“</w:t>
+      </w:r>
+      <w:r>
+        <w:t xml:space="preserve">3 Cleethorpes Ave</w:t>
+      </w:r>
+      <w:r>
+        <w:t xml:space="preserve">”</w:t>
+      </w:r>
+      <w:r>
+        <w:t xml:space="preserve">. Google labels are unreliable, but confirm from</w:t>
+      </w:r>
+      <w:r>
+        <w:t xml:space="preserve"> </w:t>
+      </w:r>
+      <w:r>
+        <w:t xml:space="preserve">title and the Council that the house beside the plot is No.1.</w:t>
       </w:r>
     </w:p>
     <w:p>
@@ -6985,13 +7300,13 @@
         <w:pStyle w:val="Compact"/>
       </w:pPr>
       <w:r>
-        <w:t xml:space="preserve">If the house is built partly on this garden, the red line includes it, and the earlier risks apply: loss of</w:t>
-      </w:r>
-      <w:r>
-        <w:t xml:space="preserve"> </w:t>
-      </w:r>
-      <w:r>
-        <w:t xml:space="preserve">garden for No.1, light to No.1’s rear windows, and the officer’s view on garden development.</w:t>
+        <w:t xml:space="preserve">BRE 209 normally ignores trees and hedges, so the daylight baseline will probably be taken as if</w:t>
+      </w:r>
+      <w:r>
+        <w:t xml:space="preserve"> </w:t>
+      </w:r>
+      <w:r>
+        <w:t xml:space="preserve">the hedge were not there. Do not argue that the hedge already blocks light to the kitchen window.</w:t>
       </w:r>
     </w:p>
     <w:p>
@@ -7003,17 +7318,50 @@
         <w:pStyle w:val="Compact"/>
       </w:pPr>
       <w:r>
-        <w:t xml:space="preserve">Use the owner’s tape measurements only as a first estimate; draw nothing at scale until surveyed.</w:t>
-      </w:r>
-    </w:p>
-    <w:bookmarkEnd w:id="44"/>
-    <w:bookmarkStart w:id="45" w:name="X407f920f89ad09ccbeed1b48049efe8fa527c9d"/>
+        <w:t xml:space="preserve">If the hedge is removed for the house: add it to the tree/hedge survey (sheet 17), the biodiversity</w:t>
+      </w:r>
+      <w:r>
+        <w:t xml:space="preserve"> </w:t>
+      </w:r>
+      <w:r>
+        <w:t xml:space="preserve">net gain baseline and a nesting-bird check. If it is kept, it may restrict where the house can go.</w:t>
+      </w:r>
+    </w:p>
+    <w:p>
+      <w:pPr>
+        <w:numPr>
+          <w:ilvl w:val="0"/>
+          <w:numId w:val="1014"/>
+        </w:numPr>
+        <w:pStyle w:val="Compact"/>
+      </w:pPr>
+      <w:r>
+        <w:t xml:space="preserve">The old brick wall may be a retaining wall; check its condition and who owns it.</w:t>
+      </w:r>
+    </w:p>
+    <w:bookmarkEnd w:id="45"/>
+    <w:bookmarkStart w:id="46" w:name="Xba6499f94da26e83058623fe6b999ee27bf74ef"/>
     <w:p>
       <w:pPr>
         <w:pStyle w:val="Heading2"/>
       </w:pPr>
       <w:r>
-        <w:t xml:space="preserve">Desk check from the aerial image (rough; NOT for submission)</w:t>
+        <w:t xml:space="preserve">Street View screenshot from Sandyhill Road (Aug 2025, labelled</w:t>
+      </w:r>
+      <w:r>
+        <w:t xml:space="preserve"> </w:t>
+      </w:r>
+      <w:r>
+        <w:t xml:space="preserve">“</w:t>
+      </w:r>
+      <w:r>
+        <w:t xml:space="preserve">113 Sandyhill Rd</w:t>
+      </w:r>
+      <w:r>
+        <w:t xml:space="preserve">”</w:t>
+      </w:r>
+      <w:r>
+        <w:t xml:space="preserve">)</w:t>
       </w:r>
     </w:p>
     <w:p>
@@ -7021,101 +7369,83 @@
         <w:pStyle w:val="FirstParagraph"/>
       </w:pPr>
       <w:r>
-        <w:t xml:space="preserve">Method: the aerial has no scale bar, so I used the parked cars (assumed about 4.3 m long) as a</w:t>
-      </w:r>
-      <w:r>
-        <w:t xml:space="preserve"> </w:t>
-      </w:r>
-      <w:r>
-        <w:t xml:space="preserve">ruler. Error is probably 25–30% or more. Replace every figure with the survey.</w:t>
-      </w:r>
-      <w:r>
-        <w:t xml:space="preserve"> </w:t>
-      </w:r>
-      <w:r>
-        <w:t xml:space="preserve">- Plot frontage to Sandyhill Road: roughly 20–25 m. Depth from the kerb to the rear boundary: roughly</w:t>
-      </w:r>
-      <w:r>
-        <w:t xml:space="preserve"> </w:t>
-      </w:r>
-      <w:r>
-        <w:t xml:space="preserve">8–12 m, deepest at the east (Cleethorpes Avenue) end and shallowest at the west end.</w:t>
-      </w:r>
-      <w:r>
-        <w:t xml:space="preserve"> </w:t>
-      </w:r>
-      <w:r>
-        <w:t xml:space="preserve">- Neighbours’ front walls to the west: roughly 6–7 m back from the kerb.</w:t>
-      </w:r>
-      <w:r>
-        <w:t xml:space="preserve"> </w:t>
-      </w:r>
-      <w:r>
-        <w:t xml:space="preserve">- Result: the neighbours’ building line, if extended across, passes through the rear part of the</w:t>
-      </w:r>
-      <w:r>
-        <w:t xml:space="preserve"> </w:t>
-      </w:r>
-      <w:r>
-        <w:t xml:space="preserve">plot. At the west end almost no plot lies behind it; at the east end more does, but that is next to No.1’s</w:t>
-      </w:r>
-      <w:r>
-        <w:t xml:space="preserve"> </w:t>
-      </w:r>
-      <w:r>
-        <w:t xml:space="preserve">gable and windows. So aligning to the building line leaves a small wedge, which would not hold a</w:t>
-      </w:r>
-      <w:r>
-        <w:t xml:space="preserve"> </w:t>
-      </w:r>
-      <w:r>
-        <w:t xml:space="preserve">4-bedroom house (about 49 m² per floor plus walls).</w:t>
-      </w:r>
-      <w:r>
-        <w:t xml:space="preserve"> </w:t>
-      </w:r>
-      <w:r>
-        <w:t xml:space="preserve">- This is why using No.1’s garden to the north-west matters: the house needs that extra depth to sit on</w:t>
-      </w:r>
-      <w:r>
-        <w:t xml:space="preserve"> </w:t>
-      </w:r>
-      <w:r>
-        <w:t xml:space="preserve">the building line. It also moves the house towards No.1’s rear windows and the garden’s</w:t>
-      </w:r>
-      <w:r>
-        <w:t xml:space="preserve"> </w:t>
-      </w:r>
-      <w:r>
-        <w:t xml:space="preserve">other boundaries, so those tests become critical.</w:t>
-      </w:r>
-      <w:r>
-        <w:t xml:space="preserve"> </w:t>
-      </w:r>
-      <w:r>
-        <w:t xml:space="preserve">- If the survey agrees, the realistic choices are: a 4-bedroom house using part of No.1’s garden, with its</w:t>
-      </w:r>
-      <w:r>
-        <w:t xml:space="preserve"> </w:t>
-      </w:r>
-      <w:r>
-        <w:t xml:space="preserve">light, privacy and garden-size tests passing; a smaller house; or ask the officer to accept a</w:t>
-      </w:r>
-      <w:r>
-        <w:t xml:space="preserve"> </w:t>
-      </w:r>
-      <w:r>
-        <w:t xml:space="preserve">building line forward of the neighbours (unlikely, given her comment).</w:t>
-      </w:r>
-    </w:p>
-    <w:bookmarkEnd w:id="45"/>
-    <w:bookmarkStart w:id="46" w:name="correction-no-building-on-no.1s-garden"/>
+        <w:t xml:space="preserve">Qualitative only; no dimensions are read from it.</w:t>
+      </w:r>
+      <w:r>
+        <w:t xml:space="preserve"> </w:t>
+      </w:r>
+      <w:r>
+        <w:t xml:space="preserve">- Plot: a grass bank behind a low brick wall with a brick-on-edge coping; the ground appears to rise</w:t>
+      </w:r>
+      <w:r>
+        <w:t xml:space="preserve"> </w:t>
+      </w:r>
+      <w:r>
+        <w:t xml:space="preserve">from the wall towards the back of the plot. This supports the officer’s point 3. The wall steps</w:t>
+      </w:r>
+      <w:r>
+        <w:t xml:space="preserve"> </w:t>
+      </w:r>
+      <w:r>
+        <w:t xml:space="preserve">down along the kerb as the road falls towards Cleethorpes Avenue.</w:t>
+      </w:r>
+      <w:r>
+        <w:t xml:space="preserve"> </w:t>
+      </w:r>
+      <w:r>
+        <w:t xml:space="preserve">- A street light column stands in front of the wall. It affects where a driveway or dropped kerb</w:t>
+      </w:r>
+      <w:r>
+        <w:t xml:space="preserve"> </w:t>
+      </w:r>
+      <w:r>
+        <w:t xml:space="preserve">could go (highways to confirm the cost and the Council’s consent to move it).</w:t>
+      </w:r>
+      <w:r>
+        <w:t xml:space="preserve"> </w:t>
+      </w:r>
+      <w:r>
+        <w:t xml:space="preserve">- A timber fence and shrubs mark the west (left) end of the plot; the boundary owner is unknown.</w:t>
+      </w:r>
+      <w:r>
+        <w:t xml:space="preserve"> </w:t>
+      </w:r>
+      <w:r>
+        <w:t xml:space="preserve">- The gable of the house behind shows the two-light first-floor window and a ground-floor</w:t>
+      </w:r>
+      <w:r>
+        <w:t xml:space="preserve"> </w:t>
+      </w:r>
+      <w:r>
+        <w:t xml:space="preserve">window partly behind shrubs, consistent with the owner’s statement.</w:t>
+      </w:r>
+      <w:r>
+        <w:t xml:space="preserve"> </w:t>
+      </w:r>
+      <w:r>
+        <w:t xml:space="preserve">- Character (point 6): neighbouring houses are two-storey red brick with pitched roofs and some</w:t>
+      </w:r>
+      <w:r>
+        <w:t xml:space="preserve"> </w:t>
+      </w:r>
+      <w:r>
+        <w:t xml:space="preserve">gable ends facing the street, so a brick, pitched-roof house is consistent with the area. Record</w:t>
+      </w:r>
+      <w:r>
+        <w:t xml:space="preserve"> </w:t>
+      </w:r>
+      <w:r>
+        <w:t xml:space="preserve">roof pitch, eaves and ridge heights, and set-backs from the survey.</w:t>
+      </w:r>
+    </w:p>
+    <w:bookmarkEnd w:id="46"/>
+    <w:bookmarkStart w:id="47" w:name="X9070192514834c408ada202f1e664c3a4f5f045"/>
     <w:p>
       <w:pPr>
         <w:pStyle w:val="Heading2"/>
       </w:pPr>
       <w:r>
-        <w:t xml:space="preserve">CORRECTION: no building on No.1’s garden</w:t>
+        <w:t xml:space="preserve">Street View screenshot looking along Sandyhill Road (building line)</w:t>
       </w:r>
     </w:p>
     <w:p>
@@ -7123,101 +7453,89 @@
         <w:pStyle w:val="FirstParagraph"/>
       </w:pPr>
       <w:r>
-        <w:t xml:space="preserve">The owner has clarified that the house will not be built on No.1’s garden. This replaces the sections</w:t>
-      </w:r>
-      <w:r>
-        <w:t xml:space="preserve"> </w:t>
-      </w:r>
-      <w:r>
-        <w:t xml:space="preserve">“</w:t>
-      </w:r>
-      <w:r>
-        <w:t xml:space="preserve">Using No.1’s back yard</w:t>
-      </w:r>
-      <w:r>
-        <w:t xml:space="preserve">”</w:t>
-      </w:r>
-      <w:r>
-        <w:t xml:space="preserve"> </w:t>
-      </w:r>
-      <w:r>
-        <w:t xml:space="preserve">and</w:t>
-      </w:r>
-      <w:r>
-        <w:t xml:space="preserve"> </w:t>
-      </w:r>
-      <w:r>
-        <w:t xml:space="preserve">“</w:t>
-      </w:r>
-      <w:r>
-        <w:t xml:space="preserve">Garden between No.1’s gable and the timber fence</w:t>
-      </w:r>
-      <w:r>
-        <w:t xml:space="preserve">”</w:t>
-      </w:r>
-      <w:r>
-        <w:t xml:space="preserve"> </w:t>
-      </w:r>
-      <w:r>
-        <w:t xml:space="preserve">above.</w:t>
-      </w:r>
-      <w:r>
-        <w:t xml:space="preserve"> </w:t>
-      </w:r>
-      <w:r>
-        <w:t xml:space="preserve">- The red line stays on the Council’s plot. No.1 keeps its whole garden, so there is no garden-loss or</w:t>
-      </w:r>
-      <w:r>
-        <w:t xml:space="preserve"> </w:t>
-      </w:r>
-      <w:r>
-        <w:t xml:space="preserve">Certificate A issue, and No.1’s rear windows are not built against.</w:t>
-      </w:r>
-      <w:r>
-        <w:t xml:space="preserve"> </w:t>
-      </w:r>
-      <w:r>
-        <w:t xml:space="preserve">- The garden’s length (end wall of No.1 to the timber fence) is used only as a reference for the plot’s</w:t>
-      </w:r>
-      <w:r>
-        <w:t xml:space="preserve"> </w:t>
-      </w:r>
-      <w:r>
-        <w:t xml:space="preserve">length along Sandyhill Road. The surveyor should measure it.</w:t>
-      </w:r>
-      <w:r>
-        <w:t xml:space="preserve"> </w:t>
-      </w:r>
-      <w:r>
-        <w:t xml:space="preserve">- The desk check above therefore stands without the garden: the neighbours’ building line leaves only a</w:t>
-      </w:r>
-      <w:r>
-        <w:t xml:space="preserve"> </w:t>
-      </w:r>
-      <w:r>
-        <w:t xml:space="preserve">small wedge of the plot, and a 4-bedroom house probably cannot sit on that line. The choices are a</w:t>
-      </w:r>
-      <w:r>
-        <w:t xml:space="preserve"> </w:t>
-      </w:r>
-      <w:r>
-        <w:t xml:space="preserve">smaller house on the line, or a 4-bedroom house forward of the line with a strong justification</w:t>
-      </w:r>
-      <w:r>
-        <w:t xml:space="preserve"> </w:t>
-      </w:r>
-      <w:r>
-        <w:t xml:space="preserve">(unlikely to satisfy the officer), or Option C. Decide after the survey.</w:t>
-      </w:r>
-    </w:p>
-    <w:bookmarkEnd w:id="46"/>
-    <w:bookmarkStart w:id="47" w:name="X396a6f8c7329361062454784a4ce38274a253e5"/>
+        <w:t xml:space="preserve">Qualitative only; the survey must measure everything.</w:t>
+      </w:r>
+      <w:r>
+        <w:t xml:space="preserve"> </w:t>
+      </w:r>
+      <w:r>
+        <w:t xml:space="preserve">- The houses on the left (west of the plot) are two-storey semi-detached, brick and render, with</w:t>
+      </w:r>
+      <w:r>
+        <w:t xml:space="preserve"> </w:t>
+      </w:r>
+      <w:r>
+        <w:t xml:space="preserve">pitched roofs and solar panels. Their fronts are set back from the footway behind raised front</w:t>
+      </w:r>
+      <w:r>
+        <w:t xml:space="preserve"> </w:t>
+      </w:r>
+      <w:r>
+        <w:t xml:space="preserve">gardens and a low brick wall. The plot’s frontage wall continues the same wall line.</w:t>
+      </w:r>
+      <w:r>
+        <w:t xml:space="preserve"> </w:t>
+      </w:r>
+      <w:r>
+        <w:t xml:space="preserve">- This supports the officer’s point 4: a house built near the plot’s wall would stand well forward of</w:t>
+      </w:r>
+      <w:r>
+        <w:t xml:space="preserve"> </w:t>
+      </w:r>
+      <w:r>
+        <w:t xml:space="preserve">those fronts. Aligning with them pushes the house back up the bank, so the buildable depth, the</w:t>
+      </w:r>
+      <w:r>
+        <w:t xml:space="preserve"> </w:t>
+      </w:r>
+      <w:r>
+        <w:t xml:space="preserve">cut and the retaining wall all increase (points 3 and 4 interact). A 4-bedroom house may not fit.</w:t>
+      </w:r>
+      <w:r>
+        <w:t xml:space="preserve"> </w:t>
+      </w:r>
+      <w:r>
+        <w:t xml:space="preserve">- A large shrub sits on the boundary with the west neighbour, and a timber fence stands at the back of</w:t>
+      </w:r>
+      <w:r>
+        <w:t xml:space="preserve"> </w:t>
+      </w:r>
+      <w:r>
+        <w:t xml:space="preserve">the plot. Ownership is unknown.</w:t>
+      </w:r>
+      <w:r>
+        <w:t xml:space="preserve"> </w:t>
+      </w:r>
+      <w:r>
+        <w:t xml:space="preserve">- The addresses of the west neighbours need confirming. The Street View label (113 Sandyhill Rd) does</w:t>
+      </w:r>
+      <w:r>
+        <w:t xml:space="preserve"> </w:t>
+      </w:r>
+      <w:r>
+        <w:t xml:space="preserve">not match the house numbers on the aerial (56, 58, 60).</w:t>
+      </w:r>
+      <w:r>
+        <w:t xml:space="preserve"> </w:t>
+      </w:r>
+      <w:r>
+        <w:t xml:space="preserve">- For the street scene (point 6): the neighbours’ ridge and eaves heights and the front garden levels</w:t>
+      </w:r>
+      <w:r>
+        <w:t xml:space="preserve"> </w:t>
+      </w:r>
+      <w:r>
+        <w:t xml:space="preserve">must be surveyed so the new house can be drawn to scale beside them.</w:t>
+      </w:r>
+    </w:p>
+    <w:bookmarkEnd w:id="47"/>
+    <w:bookmarkStart w:id="48" w:name="X9d1c10a08038de196895fc0fe663d5fed560065"/>
     <w:p>
       <w:pPr>
         <w:pStyle w:val="Heading2"/>
       </w:pPr>
       <w:r>
-        <w:t xml:space="preserve">No garden, parking at the front (owner’s wish)</w:t>
+        <w:t xml:space="preserve">What the photos show of No.1’s windows (visual reading only)</w:t>
       </w:r>
     </w:p>
     <w:p>
@@ -7229,19 +7547,19 @@
         <w:pStyle w:val="Compact"/>
       </w:pPr>
       <w:r>
-        <w:t xml:space="preserve">Helps the fit: no rear garden is needed, so the house can use all of the plot behind the building line,</w:t>
-      </w:r>
-      <w:r>
-        <w:t xml:space="preserve"> </w:t>
-      </w:r>
-      <w:r>
-        <w:t xml:space="preserve">and the area in front of the line becomes the parking forecourt. This uses the space that</w:t>
-      </w:r>
-      <w:r>
-        <w:t xml:space="preserve"> </w:t>
-      </w:r>
-      <w:r>
-        <w:t xml:space="preserve">aligning to the building line removes.</w:t>
+        <w:t xml:space="preserve">Two windows are stacked one above the other on the gable: a two-light window at first floor and a</w:t>
+      </w:r>
+      <w:r>
+        <w:t xml:space="preserve"> </w:t>
+      </w:r>
+      <w:r>
+        <w:t xml:space="preserve">ground-floor window directly below it, partly hidden by shrubs. This matches the owner’s statement</w:t>
+      </w:r>
+      <w:r>
+        <w:t xml:space="preserve"> </w:t>
+      </w:r>
+      <w:r>
+        <w:t xml:space="preserve">(bedroom above, kitchen below).</w:t>
       </w:r>
     </w:p>
     <w:p>
@@ -7253,25 +7571,13 @@
         <w:pStyle w:val="Compact"/>
       </w:pPr>
       <w:r>
-        <w:t xml:space="preserve">Planning risk: the officer and highways will still look at outdoor space for a family house</w:t>
-      </w:r>
-      <w:r>
-        <w:t xml:space="preserve"> </w:t>
-      </w:r>
-      <w:r>
-        <w:t xml:space="preserve">(check the Council’s guidance; I have not verified the wording or any minimum size) and at parking</w:t>
-      </w:r>
-      <w:r>
-        <w:t xml:space="preserve"> </w:t>
-      </w:r>
-      <w:r>
-        <w:t xml:space="preserve">for a 4-bedroom house. Say plainly why no garden is wanted, and consider a small private yard,</w:t>
-      </w:r>
-      <w:r>
-        <w:t xml:space="preserve"> </w:t>
-      </w:r>
-      <w:r>
-        <w:t xml:space="preserve">balcony or roof terrace, bin and cycle storage.</w:t>
+        <w:t xml:space="preserve">A smaller window appears near the left corner of the gable in the Street View images. Its room is</w:t>
+      </w:r>
+      <w:r>
+        <w:t xml:space="preserve"> </w:t>
+      </w:r>
+      <w:r>
+        <w:t xml:space="preserve">unknown (possibly stairs or landing); ask the owner.</w:t>
       </w:r>
     </w:p>
     <w:p>
@@ -7283,36 +7589,404 @@
         <w:pStyle w:val="Compact"/>
       </w:pPr>
       <w:r>
-        <w:t xml:space="preserve">Parking: the earlier concept used one 2.5 × 5.0 m space; confirm the Council’s bay size and number</w:t>
-      </w:r>
-      <w:r>
-        <w:t xml:space="preserve"> </w:t>
-      </w:r>
-      <w:r>
-        <w:t xml:space="preserve">of spaces for a 4-bedroom house. The street light, the utility cabinet, the kerb and the wall</w:t>
-      </w:r>
-      <w:r>
-        <w:t xml:space="preserve"> </w:t>
-      </w:r>
-      <w:r>
-        <w:t xml:space="preserve">affect where a drive can go. Any drive needs a dropped kerb approved by highways and a gradient</w:t>
-      </w:r>
-      <w:r>
-        <w:t xml:space="preserve"> </w:t>
-      </w:r>
-      <w:r>
-        <w:t xml:space="preserve">the highway authority accepts (limit not verified).</w:t>
+        <w:t xml:space="preserve">Sizes and heights cannot be taken from these photos because of perspective and the shrubs. Use the</w:t>
+      </w:r>
+      <w:r>
+        <w:t xml:space="preserve"> </w:t>
+      </w:r>
+      <w:r>
+        <w:t xml:space="preserve">surveyor’s measurements. A straight-on photo of the gable from the footway, with a tape or</w:t>
+      </w:r>
+      <w:r>
+        <w:t xml:space="preserve"> </w:t>
+      </w:r>
+      <w:r>
+        <w:t xml:space="preserve">a 1 m rule held against the wall, would let the surveyor check the sizes quickly.</w:t>
+      </w:r>
+    </w:p>
+    <w:bookmarkEnd w:id="48"/>
+    <w:bookmarkStart w:id="49" w:name="X15eb879c7cfaeade40e490435f26eb621189b4f"/>
+    <w:p>
+      <w:pPr>
+        <w:pStyle w:val="Heading2"/>
+      </w:pPr>
+      <w:r>
+        <w:t xml:space="preserve">Garden between No.1’s gable and the timber fence (owner’s statement)</w:t>
       </w:r>
     </w:p>
     <w:p>
       <w:pPr>
         <w:numPr>
           <w:ilvl w:val="0"/>
-          <w:numId w:val="1015"/>
+          <w:numId w:val="1016"/>
         </w:numPr>
         <w:pStyle w:val="Compact"/>
       </w:pPr>
       <w:r>
+        <w:t xml:space="preserve">The photos show a timber fence at the back of the plot, near No.1’s gable. The owner says the</w:t>
+      </w:r>
+      <w:r>
+        <w:t xml:space="preserve"> </w:t>
+      </w:r>
+      <w:r>
+        <w:t xml:space="preserve">garden of No.1 runs from the end of the house to that fence and that this length can be used for the house.</w:t>
+      </w:r>
+    </w:p>
+    <w:p>
+      <w:pPr>
+        <w:numPr>
+          <w:ilvl w:val="0"/>
+          <w:numId w:val="1016"/>
+        </w:numPr>
+        <w:pStyle w:val="Compact"/>
+      </w:pPr>
+      <w:r>
+        <w:t xml:space="preserve">A fence is not proof of the legal boundary. Get the Land Registry title plan for No.1 and have the</w:t>
+      </w:r>
+      <w:r>
+        <w:t xml:space="preserve"> </w:t>
+      </w:r>
+      <w:r>
+        <w:t xml:space="preserve">surveyor plot it with the Council’s plot.</w:t>
+      </w:r>
+    </w:p>
+    <w:p>
+      <w:pPr>
+        <w:numPr>
+          <w:ilvl w:val="0"/>
+          <w:numId w:val="1016"/>
+        </w:numPr>
+        <w:pStyle w:val="Compact"/>
+      </w:pPr>
+      <w:r>
+        <w:t xml:space="preserve">If the house is built partly on this garden, the red line includes it, and the earlier risks apply: loss of</w:t>
+      </w:r>
+      <w:r>
+        <w:t xml:space="preserve"> </w:t>
+      </w:r>
+      <w:r>
+        <w:t xml:space="preserve">garden for No.1, light to No.1’s rear windows, and the officer’s view on garden development.</w:t>
+      </w:r>
+    </w:p>
+    <w:p>
+      <w:pPr>
+        <w:numPr>
+          <w:ilvl w:val="0"/>
+          <w:numId w:val="1016"/>
+        </w:numPr>
+        <w:pStyle w:val="Compact"/>
+      </w:pPr>
+      <w:r>
+        <w:t xml:space="preserve">Use the owner’s tape measurements only as a first estimate; draw nothing at scale until surveyed.</w:t>
+      </w:r>
+    </w:p>
+    <w:bookmarkEnd w:id="49"/>
+    <w:bookmarkStart w:id="50" w:name="X407f920f89ad09ccbeed1b48049efe8fa527c9d"/>
+    <w:p>
+      <w:pPr>
+        <w:pStyle w:val="Heading2"/>
+      </w:pPr>
+      <w:r>
+        <w:t xml:space="preserve">Desk check from the aerial image (rough; NOT for submission)</w:t>
+      </w:r>
+    </w:p>
+    <w:p>
+      <w:pPr>
+        <w:pStyle w:val="FirstParagraph"/>
+      </w:pPr>
+      <w:r>
+        <w:t xml:space="preserve">Method: the aerial has no scale bar, so I used the parked cars (assumed about 4.3 m long) as a</w:t>
+      </w:r>
+      <w:r>
+        <w:t xml:space="preserve"> </w:t>
+      </w:r>
+      <w:r>
+        <w:t xml:space="preserve">ruler. Error is probably 25–30% or more. Replace every figure with the survey.</w:t>
+      </w:r>
+      <w:r>
+        <w:t xml:space="preserve"> </w:t>
+      </w:r>
+      <w:r>
+        <w:t xml:space="preserve">- Plot frontage to Sandyhill Road: roughly 20–25 m. Depth from the kerb to the rear boundary: roughly</w:t>
+      </w:r>
+      <w:r>
+        <w:t xml:space="preserve"> </w:t>
+      </w:r>
+      <w:r>
+        <w:t xml:space="preserve">8–12 m, deepest at the east (Cleethorpes Avenue) end and shallowest at the west end.</w:t>
+      </w:r>
+      <w:r>
+        <w:t xml:space="preserve"> </w:t>
+      </w:r>
+      <w:r>
+        <w:t xml:space="preserve">- Neighbours’ front walls to the west: roughly 6–7 m back from the kerb.</w:t>
+      </w:r>
+      <w:r>
+        <w:t xml:space="preserve"> </w:t>
+      </w:r>
+      <w:r>
+        <w:t xml:space="preserve">- Result: the neighbours’ building line, if extended across, passes through the rear part of the</w:t>
+      </w:r>
+      <w:r>
+        <w:t xml:space="preserve"> </w:t>
+      </w:r>
+      <w:r>
+        <w:t xml:space="preserve">plot. At the west end almost no plot lies behind it; at the east end more does, but that is next to No.1’s</w:t>
+      </w:r>
+      <w:r>
+        <w:t xml:space="preserve"> </w:t>
+      </w:r>
+      <w:r>
+        <w:t xml:space="preserve">gable and windows. So aligning to the building line leaves a small wedge, which would not hold a</w:t>
+      </w:r>
+      <w:r>
+        <w:t xml:space="preserve"> </w:t>
+      </w:r>
+      <w:r>
+        <w:t xml:space="preserve">4-bedroom house (about 49 m² per floor plus walls).</w:t>
+      </w:r>
+      <w:r>
+        <w:t xml:space="preserve"> </w:t>
+      </w:r>
+      <w:r>
+        <w:t xml:space="preserve">- This is why using No.1’s garden to the north-west matters: the house needs that extra depth to sit on</w:t>
+      </w:r>
+      <w:r>
+        <w:t xml:space="preserve"> </w:t>
+      </w:r>
+      <w:r>
+        <w:t xml:space="preserve">the building line. It also moves the house towards No.1’s rear windows and the garden’s</w:t>
+      </w:r>
+      <w:r>
+        <w:t xml:space="preserve"> </w:t>
+      </w:r>
+      <w:r>
+        <w:t xml:space="preserve">other boundaries, so those tests become critical.</w:t>
+      </w:r>
+      <w:r>
+        <w:t xml:space="preserve"> </w:t>
+      </w:r>
+      <w:r>
+        <w:t xml:space="preserve">- If the survey agrees, the realistic choices are: a 4-bedroom house using part of No.1’s garden, with its</w:t>
+      </w:r>
+      <w:r>
+        <w:t xml:space="preserve"> </w:t>
+      </w:r>
+      <w:r>
+        <w:t xml:space="preserve">light, privacy and garden-size tests passing; a smaller house; or ask the officer to accept a</w:t>
+      </w:r>
+      <w:r>
+        <w:t xml:space="preserve"> </w:t>
+      </w:r>
+      <w:r>
+        <w:t xml:space="preserve">building line forward of the neighbours (unlikely, given her comment).</w:t>
+      </w:r>
+    </w:p>
+    <w:bookmarkEnd w:id="50"/>
+    <w:bookmarkStart w:id="51" w:name="correction-no-building-on-no.1s-garden"/>
+    <w:p>
+      <w:pPr>
+        <w:pStyle w:val="Heading2"/>
+      </w:pPr>
+      <w:r>
+        <w:t xml:space="preserve">CORRECTION: no building on No.1’s garden</w:t>
+      </w:r>
+    </w:p>
+    <w:p>
+      <w:pPr>
+        <w:pStyle w:val="FirstParagraph"/>
+      </w:pPr>
+      <w:r>
+        <w:t xml:space="preserve">The owner has clarified that the house will not be built on No.1’s garden. This replaces the sections</w:t>
+      </w:r>
+      <w:r>
+        <w:t xml:space="preserve"> </w:t>
+      </w:r>
+      <w:r>
+        <w:t xml:space="preserve">“</w:t>
+      </w:r>
+      <w:r>
+        <w:t xml:space="preserve">Using No.1’s back yard</w:t>
+      </w:r>
+      <w:r>
+        <w:t xml:space="preserve">”</w:t>
+      </w:r>
+      <w:r>
+        <w:t xml:space="preserve"> </w:t>
+      </w:r>
+      <w:r>
+        <w:t xml:space="preserve">and</w:t>
+      </w:r>
+      <w:r>
+        <w:t xml:space="preserve"> </w:t>
+      </w:r>
+      <w:r>
+        <w:t xml:space="preserve">“</w:t>
+      </w:r>
+      <w:r>
+        <w:t xml:space="preserve">Garden between No.1’s gable and the timber fence</w:t>
+      </w:r>
+      <w:r>
+        <w:t xml:space="preserve">”</w:t>
+      </w:r>
+      <w:r>
+        <w:t xml:space="preserve"> </w:t>
+      </w:r>
+      <w:r>
+        <w:t xml:space="preserve">above.</w:t>
+      </w:r>
+      <w:r>
+        <w:t xml:space="preserve"> </w:t>
+      </w:r>
+      <w:r>
+        <w:t xml:space="preserve">- The red line stays on the Council’s plot. No.1 keeps its whole garden, so there is no garden-loss or</w:t>
+      </w:r>
+      <w:r>
+        <w:t xml:space="preserve"> </w:t>
+      </w:r>
+      <w:r>
+        <w:t xml:space="preserve">Certificate A issue, and No.1’s rear windows are not built against.</w:t>
+      </w:r>
+      <w:r>
+        <w:t xml:space="preserve"> </w:t>
+      </w:r>
+      <w:r>
+        <w:t xml:space="preserve">- The garden’s length (end wall of No.1 to the timber fence) is used only as a reference for the plot’s</w:t>
+      </w:r>
+      <w:r>
+        <w:t xml:space="preserve"> </w:t>
+      </w:r>
+      <w:r>
+        <w:t xml:space="preserve">length along Sandyhill Road. The surveyor should measure it.</w:t>
+      </w:r>
+      <w:r>
+        <w:t xml:space="preserve"> </w:t>
+      </w:r>
+      <w:r>
+        <w:t xml:space="preserve">- The desk check above therefore stands without the garden: the neighbours’ building line leaves only a</w:t>
+      </w:r>
+      <w:r>
+        <w:t xml:space="preserve"> </w:t>
+      </w:r>
+      <w:r>
+        <w:t xml:space="preserve">small wedge of the plot, and a 4-bedroom house probably cannot sit on that line. The choices are a</w:t>
+      </w:r>
+      <w:r>
+        <w:t xml:space="preserve"> </w:t>
+      </w:r>
+      <w:r>
+        <w:t xml:space="preserve">smaller house on the line, or a 4-bedroom house forward of the line with a strong justification</w:t>
+      </w:r>
+      <w:r>
+        <w:t xml:space="preserve"> </w:t>
+      </w:r>
+      <w:r>
+        <w:t xml:space="preserve">(unlikely to satisfy the officer), or Option C. Decide after the survey.</w:t>
+      </w:r>
+    </w:p>
+    <w:bookmarkEnd w:id="51"/>
+    <w:bookmarkStart w:id="52" w:name="X396a6f8c7329361062454784a4ce38274a253e5"/>
+    <w:p>
+      <w:pPr>
+        <w:pStyle w:val="Heading2"/>
+      </w:pPr>
+      <w:r>
+        <w:t xml:space="preserve">No garden, parking at the front (owner’s wish)</w:t>
+      </w:r>
+    </w:p>
+    <w:p>
+      <w:pPr>
+        <w:numPr>
+          <w:ilvl w:val="0"/>
+          <w:numId w:val="1017"/>
+        </w:numPr>
+        <w:pStyle w:val="Compact"/>
+      </w:pPr>
+      <w:r>
+        <w:t xml:space="preserve">Helps the fit: no rear garden is needed, so the house can use all of the plot behind the building line,</w:t>
+      </w:r>
+      <w:r>
+        <w:t xml:space="preserve"> </w:t>
+      </w:r>
+      <w:r>
+        <w:t xml:space="preserve">and the area in front of the line becomes the parking forecourt. This uses the space that</w:t>
+      </w:r>
+      <w:r>
+        <w:t xml:space="preserve"> </w:t>
+      </w:r>
+      <w:r>
+        <w:t xml:space="preserve">aligning to the building line removes.</w:t>
+      </w:r>
+    </w:p>
+    <w:p>
+      <w:pPr>
+        <w:numPr>
+          <w:ilvl w:val="0"/>
+          <w:numId w:val="1017"/>
+        </w:numPr>
+        <w:pStyle w:val="Compact"/>
+      </w:pPr>
+      <w:r>
+        <w:t xml:space="preserve">Planning risk: the officer and highways will still look at outdoor space for a family house</w:t>
+      </w:r>
+      <w:r>
+        <w:t xml:space="preserve"> </w:t>
+      </w:r>
+      <w:r>
+        <w:t xml:space="preserve">(check the Council’s guidance; I have not verified the wording or any minimum size) and at parking</w:t>
+      </w:r>
+      <w:r>
+        <w:t xml:space="preserve"> </w:t>
+      </w:r>
+      <w:r>
+        <w:t xml:space="preserve">for a 4-bedroom house. Say plainly why no garden is wanted, and consider a small private yard,</w:t>
+      </w:r>
+      <w:r>
+        <w:t xml:space="preserve"> </w:t>
+      </w:r>
+      <w:r>
+        <w:t xml:space="preserve">balcony or roof terrace, bin and cycle storage.</w:t>
+      </w:r>
+    </w:p>
+    <w:p>
+      <w:pPr>
+        <w:numPr>
+          <w:ilvl w:val="0"/>
+          <w:numId w:val="1017"/>
+        </w:numPr>
+        <w:pStyle w:val="Compact"/>
+      </w:pPr>
+      <w:r>
+        <w:t xml:space="preserve">Parking: the earlier concept used one 2.5 × 5.0 m space; confirm the Council’s bay size and number</w:t>
+      </w:r>
+      <w:r>
+        <w:t xml:space="preserve"> </w:t>
+      </w:r>
+      <w:r>
+        <w:t xml:space="preserve">of spaces for a 4-bedroom house. The street light, the utility cabinet, the kerb and the wall</w:t>
+      </w:r>
+      <w:r>
+        <w:t xml:space="preserve"> </w:t>
+      </w:r>
+      <w:r>
+        <w:t xml:space="preserve">affect where a drive can go. Any drive needs a dropped kerb approved by highways and a gradient</w:t>
+      </w:r>
+      <w:r>
+        <w:t xml:space="preserve"> </w:t>
+      </w:r>
+      <w:r>
+        <w:t xml:space="preserve">the highway authority accepts (limit not verified).</w:t>
+      </w:r>
+    </w:p>
+    <w:p>
+      <w:pPr>
+        <w:numPr>
+          <w:ilvl w:val="0"/>
+          <w:numId w:val="1017"/>
+        </w:numPr>
+        <w:pStyle w:val="Compact"/>
+      </w:pPr>
+      <w:r>
         <w:t xml:space="preserve">Levels: a forecourt near footway level means cutting the bank back and rebuilding the wall; this</w:t>
       </w:r>
       <w:r>
@@ -7328,8 +8002,8 @@
         <w:t xml:space="preserve">baseline) and adds surface water: consider permeable paving.</w:t>
       </w:r>
     </w:p>
-    <w:bookmarkEnd w:id="47"/>
-    <w:bookmarkStart w:id="48" w:name="Xfc59e04da05cd1acab9c1376a02b5d8c9a3bc9f"/>
+    <w:bookmarkEnd w:id="52"/>
+    <w:bookmarkStart w:id="53" w:name="Xfc59e04da05cd1acab9c1376a02b5d8c9a3bc9f"/>
     <w:p>
       <w:pPr>
         <w:pStyle w:val="Heading2"/>
@@ -7504,8 +8178,244 @@
         <w:t xml:space="preserve">mass beside No.1; the officer already doubts the site. I have not used it as the lead scheme.</w:t>
       </w:r>
     </w:p>
-    <w:bookmarkEnd w:id="48"/>
-    <w:bookmarkEnd w:id="49"/>
+    <w:bookmarkEnd w:id="53"/>
+    <w:bookmarkStart w:id="54" w:name="two-front-parking-spaces-owners-request"/>
+    <w:p>
+      <w:pPr>
+        <w:pStyle w:val="Heading2"/>
+      </w:pPr>
+      <w:r>
+        <w:t xml:space="preserve">Two front parking spaces (owner’s request)</w:t>
+      </w:r>
+    </w:p>
+    <w:p>
+      <w:pPr>
+        <w:numPr>
+          <w:ilvl w:val="0"/>
+          <w:numId w:val="1018"/>
+        </w:numPr>
+        <w:pStyle w:val="Compact"/>
+      </w:pPr>
+      <w:r>
+        <w:t xml:space="preserve">Layout: two bays side by side, about 5 m wide (2 × 2.5 m) and 5 m deep, plus a dropped kerb; the</w:t>
+      </w:r>
+      <w:r>
+        <w:t xml:space="preserve"> </w:t>
+      </w:r>
+      <w:r>
+        <w:t xml:space="preserve">house stays on the building line. Tandem bays would need about 10 m depth, which the plot does not</w:t>
+      </w:r>
+      <w:r>
+        <w:t xml:space="preserve"> </w:t>
+      </w:r>
+      <w:r>
+        <w:t xml:space="preserve">have, so side by side is the only layout I have drawn.</w:t>
+      </w:r>
+    </w:p>
+    <w:p>
+      <w:pPr>
+        <w:numPr>
+          <w:ilvl w:val="0"/>
+          <w:numId w:val="1018"/>
+        </w:numPr>
+        <w:pStyle w:val="Compact"/>
+      </w:pPr>
+      <w:r>
+        <w:t xml:space="preserve">Depth check (from the rough desk estimate only): the neighbours’ fronts are roughly 6–7 m back from the</w:t>
+      </w:r>
+      <w:r>
+        <w:t xml:space="preserve"> </w:t>
+      </w:r>
+      <w:r>
+        <w:t xml:space="preserve">kerb, and the footway takes part of that. So a 5 m deep bay may not fit in front of the line; a car</w:t>
+      </w:r>
+      <w:r>
+        <w:t xml:space="preserve"> </w:t>
+      </w:r>
+      <w:r>
+        <w:t xml:space="preserve">overhanging the footway will not be accepted. The survey decides. If it is short, the house sits</w:t>
+      </w:r>
+      <w:r>
+        <w:t xml:space="preserve"> </w:t>
+      </w:r>
+      <w:r>
+        <w:t xml:space="preserve">further back (more cut into the bank) or one space is dropped.</w:t>
+      </w:r>
+    </w:p>
+    <w:p>
+      <w:pPr>
+        <w:numPr>
+          <w:ilvl w:val="0"/>
+          <w:numId w:val="1018"/>
+        </w:numPr>
+        <w:pStyle w:val="Compact"/>
+      </w:pPr>
+      <w:r>
+        <w:t xml:space="preserve">One crossover for two bays is easier to get approved than two. Highways decides width and</w:t>
+      </w:r>
+      <w:r>
+        <w:t xml:space="preserve"> </w:t>
+      </w:r>
+      <w:r>
+        <w:t xml:space="preserve">position (not verified). The street light column, the utility cabinet and the kerb must be avoided or moved.</w:t>
+      </w:r>
+    </w:p>
+    <w:p>
+      <w:pPr>
+        <w:numPr>
+          <w:ilvl w:val="0"/>
+          <w:numId w:val="1018"/>
+        </w:numPr>
+        <w:pStyle w:val="Compact"/>
+      </w:pPr>
+      <w:r>
+        <w:t xml:space="preserve">Corner: the plot is next to the Cleethorpes Avenue junction. The drive nearer the junction gives</w:t>
+      </w:r>
+      <w:r>
+        <w:t xml:space="preserve"> </w:t>
+      </w:r>
+      <w:r>
+        <w:t xml:space="preserve">highways visibility questions; the drive further west is safer for visibility but puts the house nearer</w:t>
+      </w:r>
+      <w:r>
+        <w:t xml:space="preserve"> </w:t>
+      </w:r>
+      <w:r>
+        <w:t xml:space="preserve">No.1 or reduces the gap. Highways must say which they prefer.</w:t>
+      </w:r>
+    </w:p>
+    <w:p>
+      <w:pPr>
+        <w:numPr>
+          <w:ilvl w:val="0"/>
+          <w:numId w:val="1018"/>
+        </w:numPr>
+        <w:pStyle w:val="Compact"/>
+      </w:pPr>
+      <w:r>
+        <w:t xml:space="preserve">Gradient and surface: the forecourt needs a gradient highways accepts (limit not verified); the bank</w:t>
+      </w:r>
+      <w:r>
+        <w:t xml:space="preserve"> </w:t>
+      </w:r>
+      <w:r>
+        <w:t xml:space="preserve">must be cut back and the wall rebuilt. Use permeable paving.</w:t>
+      </w:r>
+    </w:p>
+    <w:p>
+      <w:pPr>
+        <w:numPr>
+          <w:ilvl w:val="0"/>
+          <w:numId w:val="1018"/>
+        </w:numPr>
+        <w:pStyle w:val="Compact"/>
+      </w:pPr>
+      <w:r>
+        <w:t xml:space="preserve">Planning gain: two spaces answer the likely highways concern better than one.</w:t>
+      </w:r>
+    </w:p>
+    <w:bookmarkEnd w:id="54"/>
+    <w:bookmarkStart w:id="55" w:name="drawings-and-visual-added-notional"/>
+    <w:p>
+      <w:pPr>
+        <w:pStyle w:val="Heading2"/>
+      </w:pPr>
+      <w:r>
+        <w:t xml:space="preserve">Drawings and visual added (notional)</w:t>
+      </w:r>
+    </w:p>
+    <w:p>
+      <w:pPr>
+        <w:numPr>
+          <w:ilvl w:val="0"/>
+          <w:numId w:val="1019"/>
+        </w:numPr>
+        <w:pStyle w:val="Compact"/>
+      </w:pPr>
+      <w:r>
+        <w:rPr>
+          <w:rStyle w:val="VerbatimChar"/>
+        </w:rPr>
+        <w:t xml:space="preserve">layouts-2bed-vs-hmo</w:t>
+      </w:r>
+      <w:r>
+        <w:t xml:space="preserve">: floor plans rotated so the long side (7.3 m internal) faces the street and the block is</w:t>
+      </w:r>
+      <w:r>
+        <w:t xml:space="preserve"> </w:t>
+      </w:r>
+      <w:r>
+        <w:t xml:space="preserve">5.5 m deep, because the plot is shallow.</w:t>
+      </w:r>
+    </w:p>
+    <w:p>
+      <w:pPr>
+        <w:numPr>
+          <w:ilvl w:val="0"/>
+          <w:numId w:val="1019"/>
+        </w:numPr>
+        <w:pStyle w:val="Compact"/>
+      </w:pPr>
+      <w:r>
+        <w:rPr>
+          <w:rStyle w:val="VerbatimChar"/>
+        </w:rPr>
+        <w:t xml:space="preserve">elevations-notional</w:t>
+      </w:r>
+      <w:r>
+        <w:t xml:space="preserve">: front and side elevations of a two-storey house (assumed 5.0 m eaves, 35° pitch,</w:t>
+      </w:r>
+      <w:r>
+        <w:t xml:space="preserve"> </w:t>
+      </w:r>
+      <w:r>
+        <w:t xml:space="preserve">about 7.2 m ridge, about 8.0 × 6.2 m outside). All values are design assumptions.</w:t>
+      </w:r>
+    </w:p>
+    <w:p>
+      <w:pPr>
+        <w:numPr>
+          <w:ilvl w:val="0"/>
+          <w:numId w:val="1019"/>
+        </w:numPr>
+        <w:pStyle w:val="Compact"/>
+      </w:pPr>
+      <w:r>
+        <w:rPr>
+          <w:rStyle w:val="VerbatimChar"/>
+        </w:rPr>
+        <w:t xml:space="preserve">visual-illustrative</w:t>
+      </w:r>
+      <w:r>
+        <w:t xml:space="preserve">: a diagrammatic view from the south-east. Illustration only, not for the application.</w:t>
+      </w:r>
+    </w:p>
+    <w:p>
+      <w:pPr>
+        <w:numPr>
+          <w:ilvl w:val="0"/>
+          <w:numId w:val="1019"/>
+        </w:numPr>
+        <w:pStyle w:val="Compact"/>
+      </w:pPr>
+      <w:r>
+        <w:t xml:space="preserve">Siting warning: my rough aerial check found little plot depth behind the neighbours’ building line at the west</w:t>
+      </w:r>
+      <w:r>
+        <w:t xml:space="preserve"> </w:t>
+      </w:r>
+      <w:r>
+        <w:t xml:space="preserve">end, so the house probably cannot sit at the extreme west end. In the visual it is placed mid-plot. The survey</w:t>
+      </w:r>
+      <w:r>
+        <w:t xml:space="preserve"> </w:t>
+      </w:r>
+      <w:r>
+        <w:t xml:space="preserve">decides the position, and a house nearer No.1 would need the daylight tests to pass.</w:t>
+      </w:r>
+    </w:p>
+    <w:bookmarkEnd w:id="55"/>
+    <w:bookmarkEnd w:id="56"/>
     <w:sectPr/>
   </w:body>
 </w:document>
@@ -7928,7 +8838,34 @@
     <w:abstractNumId w:val="991"/>
   </w:num>
   <w:num w:numId="1005">
-    <w:abstractNumId w:val="991"/>
+    <w:abstractNumId w:val="99411"/>
+    <w:lvlOverride w:ilvl="0">
+      <w:startOverride w:val="1"/>
+    </w:lvlOverride>
+    <w:lvlOverride w:ilvl="1">
+      <w:startOverride w:val="1"/>
+    </w:lvlOverride>
+    <w:lvlOverride w:ilvl="2">
+      <w:startOverride w:val="1"/>
+    </w:lvlOverride>
+    <w:lvlOverride w:ilvl="3">
+      <w:startOverride w:val="1"/>
+    </w:lvlOverride>
+    <w:lvlOverride w:ilvl="4">
+      <w:startOverride w:val="1"/>
+    </w:lvlOverride>
+    <w:lvlOverride w:ilvl="5">
+      <w:startOverride w:val="1"/>
+    </w:lvlOverride>
+    <w:lvlOverride w:ilvl="6">
+      <w:startOverride w:val="1"/>
+    </w:lvlOverride>
+    <w:lvlOverride w:ilvl="7">
+      <w:startOverride w:val="1"/>
+    </w:lvlOverride>
+    <w:lvlOverride w:ilvl="8">
+      <w:startOverride w:val="1"/>
+    </w:lvlOverride>
   </w:num>
   <w:num w:numId="1006">
     <w:abstractNumId w:val="991"/>
@@ -7958,6 +8895,18 @@
     <w:abstractNumId w:val="991"/>
   </w:num>
   <w:num w:numId="1015">
+    <w:abstractNumId w:val="991"/>
+  </w:num>
+  <w:num w:numId="1016">
+    <w:abstractNumId w:val="991"/>
+  </w:num>
+  <w:num w:numId="1017">
+    <w:abstractNumId w:val="991"/>
+  </w:num>
+  <w:num w:numId="1018">
+    <w:abstractNumId w:val="991"/>
+  </w:num>
+  <w:num w:numId="1019">
     <w:abstractNumId w:val="991"/>
   </w:num>
 </w:numbering>

</xml_diff>